<commit_message>
November 2024 Publication Updates (Dates, Analyst Names and also new template for report and summary
</commit_message>
<xml_diff>
--- a/markdown/phs-accrstats-cover.docx
+++ b/markdown/phs-accrstats-cover.docx
@@ -1,6 +1,6 @@
 
 <file path=word/document.xml><?xml version="1.0" encoding="utf-8"?>
-<w:document xmlns:wpc="http://schemas.microsoft.com/office/word/2010/wordprocessingCanvas" xmlns:cx="http://schemas.microsoft.com/office/drawing/2014/chartex" xmlns:cx1="http://schemas.microsoft.com/office/drawing/2015/9/8/chartex" xmlns:cx2="http://schemas.microsoft.com/office/drawing/2015/10/21/chartex" xmlns:cx3="http://schemas.microsoft.com/office/drawing/2016/5/9/chartex" xmlns:cx4="http://schemas.microsoft.com/office/drawing/2016/5/10/chartex" xmlns:cx5="http://schemas.microsoft.com/office/drawing/2016/5/11/chartex" xmlns:cx6="http://schemas.microsoft.com/office/drawing/2016/5/12/chartex" xmlns:cx7="http://schemas.microsoft.com/office/drawing/2016/5/13/chartex" xmlns:cx8="http://schemas.microsoft.com/office/drawing/2016/5/14/chartex" xmlns:mc="http://schemas.openxmlformats.org/markup-compatibility/2006" xmlns:aink="http://schemas.microsoft.com/office/drawing/2016/ink" xmlns:am3d="http://schemas.microsoft.com/office/drawing/2017/model3d" xmlns:o="urn:schemas-microsoft-com:office:office" xmlns:oel="http://schemas.microsoft.com/office/2019/extlst" xmlns:r="http://schemas.openxmlformats.org/officeDocument/2006/relationships" xmlns:m="http://schemas.openxmlformats.org/officeDocument/2006/math" xmlns:v="urn:schemas-microsoft-com:vml" xmlns:wp14="http://schemas.microsoft.com/office/word/2010/wordprocessingDrawing" xmlns:wp="http://schemas.openxmlformats.org/drawingml/2006/wordprocessingDrawing" xmlns:w10="urn:schemas-microsoft-com:office:word" xmlns:w="http://schemas.openxmlformats.org/wordprocessingml/2006/main" xmlns:w14="http://schemas.microsoft.com/office/word/2010/wordml" xmlns:w15="http://schemas.microsoft.com/office/word/2012/wordml" xmlns:w16cex="http://schemas.microsoft.com/office/word/2018/wordml/cex" xmlns:w16cid="http://schemas.microsoft.com/office/word/2016/wordml/cid" xmlns:w16="http://schemas.microsoft.com/office/word/2018/wordml" xmlns:w16sdtdh="http://schemas.microsoft.com/office/word/2020/wordml/sdtdatahash" xmlns:w16se="http://schemas.microsoft.com/office/word/2015/wordml/symex" xmlns:wpg="http://schemas.microsoft.com/office/word/2010/wordprocessingGroup" xmlns:wpi="http://schemas.microsoft.com/office/word/2010/wordprocessingInk" xmlns:wne="http://schemas.microsoft.com/office/word/2006/wordml" xmlns:wps="http://schemas.microsoft.com/office/word/2010/wordprocessingShape" mc:Ignorable="w14 w15 w16se w16cid w16 w16cex w16sdtdh wp14">
+<w:document xmlns:wpc="http://schemas.microsoft.com/office/word/2010/wordprocessingCanvas" xmlns:cx="http://schemas.microsoft.com/office/drawing/2014/chartex" xmlns:cx1="http://schemas.microsoft.com/office/drawing/2015/9/8/chartex" xmlns:cx2="http://schemas.microsoft.com/office/drawing/2015/10/21/chartex" xmlns:cx3="http://schemas.microsoft.com/office/drawing/2016/5/9/chartex" xmlns:cx4="http://schemas.microsoft.com/office/drawing/2016/5/10/chartex" xmlns:cx5="http://schemas.microsoft.com/office/drawing/2016/5/11/chartex" xmlns:cx6="http://schemas.microsoft.com/office/drawing/2016/5/12/chartex" xmlns:cx7="http://schemas.microsoft.com/office/drawing/2016/5/13/chartex" xmlns:cx8="http://schemas.microsoft.com/office/drawing/2016/5/14/chartex" xmlns:mc="http://schemas.openxmlformats.org/markup-compatibility/2006" xmlns:aink="http://schemas.microsoft.com/office/drawing/2016/ink" xmlns:am3d="http://schemas.microsoft.com/office/drawing/2017/model3d" xmlns:o="urn:schemas-microsoft-com:office:office" xmlns:oel="http://schemas.microsoft.com/office/2019/extlst" xmlns:r="http://schemas.openxmlformats.org/officeDocument/2006/relationships" xmlns:m="http://schemas.openxmlformats.org/officeDocument/2006/math" xmlns:v="urn:schemas-microsoft-com:vml" xmlns:wp14="http://schemas.microsoft.com/office/word/2010/wordprocessingDrawing" xmlns:wp="http://schemas.openxmlformats.org/drawingml/2006/wordprocessingDrawing" xmlns:w10="urn:schemas-microsoft-com:office:word" xmlns:w="http://schemas.openxmlformats.org/wordprocessingml/2006/main" xmlns:w14="http://schemas.microsoft.com/office/word/2010/wordml" xmlns:w15="http://schemas.microsoft.com/office/word/2012/wordml" xmlns:w16cex="http://schemas.microsoft.com/office/word/2018/wordml/cex" xmlns:w16cid="http://schemas.microsoft.com/office/word/2016/wordml/cid" xmlns:w16="http://schemas.microsoft.com/office/word/2018/wordml" xmlns:w16du="http://schemas.microsoft.com/office/word/2023/wordml/word16du" xmlns:w16sdtdh="http://schemas.microsoft.com/office/word/2020/wordml/sdtdatahash" xmlns:w16se="http://schemas.microsoft.com/office/word/2015/wordml/symex" xmlns:wpg="http://schemas.microsoft.com/office/word/2010/wordprocessingGroup" xmlns:wpi="http://schemas.microsoft.com/office/word/2010/wordprocessingInk" xmlns:wne="http://schemas.microsoft.com/office/word/2006/wordml" xmlns:wps="http://schemas.microsoft.com/office/word/2010/wordprocessingShape" mc:Ignorable="w14 w15 w16se w16cid w16 w16cex w16sdtdh w16du wp14">
   <w:body>
     <w:p>
       <w:pPr>
@@ -41,71 +41,257 @@
     </w:p>
     <w:p>
       <w:pPr>
-        <w:pStyle w:val="PublicationTitle"/>
-      </w:pPr>
-      <w:bookmarkStart w:id="1" w:name="_Toc324429979"/>
-      <w:bookmarkStart w:id="2" w:name="_Toc324429932"/>
-      <w:bookmarkStart w:id="3" w:name="_Toc323040046"/>
-      <w:bookmarkStart w:id="4" w:name="_Toc322600037"/>
-      <w:bookmarkStart w:id="5" w:name="_Toc322600015"/>
-      <w:bookmarkStart w:id="6" w:name="_Toc322599008"/>
+        <w:pStyle w:val="Coverdisclaimer"/>
+      </w:pPr>
       <w:r>
-        <w:t>Title</w:t>
+        <w:rPr>
+          <w:noProof/>
+          <w:lang w:eastAsia="en-GB"/>
+        </w:rPr>
+        <mc:AlternateContent>
+          <mc:Choice Requires="wps">
+            <w:drawing>
+              <wp:inline distT="0" distB="0" distL="0" distR="0" wp14:anchorId="14B3970C" wp14:editId="48B66E17">
+                <wp:extent cx="5580000" cy="2847975"/>
+                <wp:effectExtent l="0" t="0" r="0" b="9525"/>
+                <wp:docPr id="12" name="Text Box 2"/>
+                <wp:cNvGraphicFramePr>
+                  <a:graphicFrameLocks xmlns:a="http://schemas.openxmlformats.org/drawingml/2006/main"/>
+                </wp:cNvGraphicFramePr>
+                <a:graphic xmlns:a="http://schemas.openxmlformats.org/drawingml/2006/main">
+                  <a:graphicData uri="http://schemas.microsoft.com/office/word/2010/wordprocessingShape">
+                    <wps:wsp>
+                      <wps:cNvSpPr txBox="1">
+                        <a:spLocks noChangeArrowheads="1"/>
+                      </wps:cNvSpPr>
+                      <wps:spPr bwMode="auto">
+                        <a:xfrm>
+                          <a:off x="0" y="0"/>
+                          <a:ext cx="5580000" cy="2847975"/>
+                        </a:xfrm>
+                        <a:prstGeom prst="rect">
+                          <a:avLst/>
+                        </a:prstGeom>
+                        <a:noFill/>
+                        <a:ln>
+                          <a:noFill/>
+                        </a:ln>
+                        <a:extLst>
+                          <a:ext uri="{909E8E84-426E-40DD-AFC4-6F175D3DCCD1}">
+                            <a14:hiddenFill xmlns:a14="http://schemas.microsoft.com/office/drawing/2010/main">
+                              <a:solidFill>
+                                <a:srgbClr val="FFFFFF"/>
+                              </a:solidFill>
+                            </a14:hiddenFill>
+                          </a:ext>
+                          <a:ext uri="{91240B29-F687-4F45-9708-019B960494DF}">
+                            <a14:hiddenLine xmlns:a14="http://schemas.microsoft.com/office/drawing/2010/main" w="9525">
+                              <a:solidFill>
+                                <a:srgbClr val="000000"/>
+                              </a:solidFill>
+                              <a:miter lim="800000"/>
+                              <a:headEnd/>
+                              <a:tailEnd/>
+                            </a14:hiddenLine>
+                          </a:ext>
+                        </a:extLst>
+                      </wps:spPr>
+                      <wps:txbx>
+                        <w:txbxContent>
+                          <w:bookmarkStart w:id="1" w:name="_Toc324429979" w:displacedByCustomXml="next"/>
+                          <w:bookmarkStart w:id="2" w:name="_Toc324429932" w:displacedByCustomXml="next"/>
+                          <w:bookmarkStart w:id="3" w:name="_Toc323040046" w:displacedByCustomXml="next"/>
+                          <w:bookmarkStart w:id="4" w:name="_Toc322600037" w:displacedByCustomXml="next"/>
+                          <w:bookmarkStart w:id="5" w:name="_Toc322600015" w:displacedByCustomXml="next"/>
+                          <w:bookmarkStart w:id="6" w:name="_Toc322599008" w:displacedByCustomXml="next"/>
+                          <w:sdt>
+                            <w:sdtPr>
+                              <w:alias w:val="Title"/>
+                              <w:tag w:val=""/>
+                              <w:id w:val="1997915227"/>
+                              <w:placeholder>
+                                <w:docPart w:val="7D12028B95D1447F9D38610B8038AAD5"/>
+                              </w:placeholder>
+                              <w:dataBinding w:prefixMappings="xmlns:ns0='http://purl.org/dc/elements/1.1/' xmlns:ns1='http://schemas.openxmlformats.org/package/2006/metadata/core-properties' " w:xpath="/ns1:coreProperties[1]/ns0:title[1]" w:storeItemID="{6C3C8BC8-F283-45AE-878A-BAB7291924A1}"/>
+                              <w:text/>
+                            </w:sdtPr>
+                            <w:sdtEndPr/>
+                            <w:sdtContent>
+                              <w:p>
+                                <w:pPr>
+                                  <w:pStyle w:val="PublicationTitle"/>
+                                </w:pPr>
+                                <w:r>
+                                  <w:t>Publication title</w:t>
+                                </w:r>
+                              </w:p>
+                            </w:sdtContent>
+                          </w:sdt>
+                          <w:p>
+                            <w:pPr>
+                              <w:pStyle w:val="Publicationsubtitle"/>
+                            </w:pPr>
+                            <w:r>
+                              <w:t>Subt</w:t>
+                            </w:r>
+                            <w:r>
+                              <w:t>i</w:t>
+                            </w:r>
+                            <w:r>
+                              <w:t>tle</w:t>
+                            </w:r>
+                          </w:p>
+                          <w:p>
+                            <w:pPr>
+                              <w:pStyle w:val="Statsdesignation"/>
+                            </w:pPr>
+                            <w:r>
+                              <w:t>A</w:t>
+                            </w:r>
+                            <w:r>
+                              <w:t xml:space="preserve">n </w:t>
+                            </w:r>
+                            <w:r>
+                              <w:t>A</w:t>
+                            </w:r>
+                            <w:r>
+                              <w:t xml:space="preserve">ccredited official </w:t>
+                            </w:r>
+                            <w:r>
+                              <w:t>s</w:t>
+                            </w:r>
+                            <w:r>
+                              <w:t>tatistics</w:t>
+                            </w:r>
+                            <w:r>
+                              <w:t xml:space="preserve"> release for Scotland</w:t>
+                            </w:r>
+                          </w:p>
+                          <w:p>
+                            <w:pPr>
+                              <w:pStyle w:val="Publicationdate"/>
+                            </w:pPr>
+                            <w:r>
+                              <w:t>Publication date: DD Month YYYY</w:t>
+                            </w:r>
+                            <w:bookmarkEnd w:id="6"/>
+                            <w:bookmarkEnd w:id="5"/>
+                            <w:bookmarkEnd w:id="4"/>
+                            <w:bookmarkEnd w:id="3"/>
+                            <w:bookmarkEnd w:id="2"/>
+                            <w:bookmarkEnd w:id="1"/>
+                          </w:p>
+                        </w:txbxContent>
+                      </wps:txbx>
+                      <wps:bodyPr rot="0" vert="horz" wrap="square" lIns="91440" tIns="45720" rIns="91440" bIns="45720" anchor="t" anchorCtr="0" upright="1">
+                        <a:noAutofit/>
+                      </wps:bodyPr>
+                    </wps:wsp>
+                  </a:graphicData>
+                </a:graphic>
+              </wp:inline>
+            </w:drawing>
+          </mc:Choice>
+          <mc:Fallback>
+            <w:pict>
+              <v:shapetype w14:anchorId="14B3970C" id="_x0000_t202" coordsize="21600,21600" o:spt="202" path="m,l,21600r21600,l21600,xe">
+                <v:stroke joinstyle="miter"/>
+                <v:path gradientshapeok="t" o:connecttype="rect"/>
+              </v:shapetype>
+              <v:shape id="Text Box 2" o:spid="_x0000_s1026" type="#_x0000_t202" style="width:439.35pt;height:224.25pt;visibility:visible;mso-wrap-style:square;mso-left-percent:-10001;mso-top-percent:-10001;mso-position-horizontal:absolute;mso-position-horizontal-relative:char;mso-position-vertical:absolute;mso-position-vertical-relative:line;mso-left-percent:-10001;mso-top-percent:-10001;v-text-anchor:top" o:gfxdata="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" filled="f" stroked="f">
+                <v:textbox>
+                  <w:txbxContent>
+                    <w:bookmarkStart w:id="7" w:name="_Toc324429979" w:displacedByCustomXml="next"/>
+                    <w:bookmarkStart w:id="8" w:name="_Toc324429932" w:displacedByCustomXml="next"/>
+                    <w:bookmarkStart w:id="9" w:name="_Toc323040046" w:displacedByCustomXml="next"/>
+                    <w:bookmarkStart w:id="10" w:name="_Toc322600037" w:displacedByCustomXml="next"/>
+                    <w:bookmarkStart w:id="11" w:name="_Toc322600015" w:displacedByCustomXml="next"/>
+                    <w:bookmarkStart w:id="12" w:name="_Toc322599008" w:displacedByCustomXml="next"/>
+                    <w:sdt>
+                      <w:sdtPr>
+                        <w:alias w:val="Title"/>
+                        <w:tag w:val=""/>
+                        <w:id w:val="1997915227"/>
+                        <w:placeholder>
+                          <w:docPart w:val="7D12028B95D1447F9D38610B8038AAD5"/>
+                        </w:placeholder>
+                        <w:dataBinding w:prefixMappings="xmlns:ns0='http://purl.org/dc/elements/1.1/' xmlns:ns1='http://schemas.openxmlformats.org/package/2006/metadata/core-properties' " w:xpath="/ns1:coreProperties[1]/ns0:title[1]" w:storeItemID="{6C3C8BC8-F283-45AE-878A-BAB7291924A1}"/>
+                        <w:text/>
+                      </w:sdtPr>
+                      <w:sdtEndPr/>
+                      <w:sdtContent>
+                        <w:p>
+                          <w:pPr>
+                            <w:pStyle w:val="PublicationTitle"/>
+                          </w:pPr>
+                          <w:r>
+                            <w:t>Publication title</w:t>
+                          </w:r>
+                        </w:p>
+                      </w:sdtContent>
+                    </w:sdt>
+                    <w:p>
+                      <w:pPr>
+                        <w:pStyle w:val="Publicationsubtitle"/>
+                      </w:pPr>
+                      <w:r>
+                        <w:t>Subt</w:t>
+                      </w:r>
+                      <w:r>
+                        <w:t>i</w:t>
+                      </w:r>
+                      <w:r>
+                        <w:t>tle</w:t>
+                      </w:r>
+                    </w:p>
+                    <w:p>
+                      <w:pPr>
+                        <w:pStyle w:val="Statsdesignation"/>
+                      </w:pPr>
+                      <w:r>
+                        <w:t>A</w:t>
+                      </w:r>
+                      <w:r>
+                        <w:t xml:space="preserve">n </w:t>
+                      </w:r>
+                      <w:r>
+                        <w:t>A</w:t>
+                      </w:r>
+                      <w:r>
+                        <w:t xml:space="preserve">ccredited official </w:t>
+                      </w:r>
+                      <w:r>
+                        <w:t>s</w:t>
+                      </w:r>
+                      <w:r>
+                        <w:t>tatistics</w:t>
+                      </w:r>
+                      <w:r>
+                        <w:t xml:space="preserve"> release for Scotland</w:t>
+                      </w:r>
+                    </w:p>
+                    <w:p>
+                      <w:pPr>
+                        <w:pStyle w:val="Publicationdate"/>
+                      </w:pPr>
+                      <w:r>
+                        <w:t>Publication date: DD Month YYYY</w:t>
+                      </w:r>
+                      <w:bookmarkEnd w:id="12"/>
+                      <w:bookmarkEnd w:id="11"/>
+                      <w:bookmarkEnd w:id="10"/>
+                      <w:bookmarkEnd w:id="9"/>
+                      <w:bookmarkEnd w:id="8"/>
+                      <w:bookmarkEnd w:id="7"/>
+                    </w:p>
+                  </w:txbxContent>
+                </v:textbox>
+                <w10:anchorlock/>
+              </v:shape>
+            </w:pict>
+          </mc:Fallback>
+        </mc:AlternateContent>
       </w:r>
-    </w:p>
-    <w:p>
-      <w:pPr>
-        <w:pStyle w:val="Publicationsubtitle"/>
-      </w:pPr>
-      <w:r>
-        <w:t>Subtitle</w:t>
-      </w:r>
-    </w:p>
-    <w:p>
-      <w:pPr>
-        <w:pStyle w:val="Statsdesignation"/>
-      </w:pPr>
-      <w:r>
-        <w:t>A</w:t>
-      </w:r>
-      <w:r>
-        <w:t>n Accredited official statistics</w:t>
-      </w:r>
-      <w:r>
-        <w:t xml:space="preserve"> </w:t>
-      </w:r>
-      <w:r>
-        <w:t>release for Scotland</w:t>
-      </w:r>
-    </w:p>
-    <w:p>
-      <w:pPr>
-        <w:pStyle w:val="Publicationdate"/>
-      </w:pPr>
-      <w:r>
-        <w:t>Publication date: DD Month YYYY</w:t>
-      </w:r>
-      <w:bookmarkEnd w:id="1"/>
-      <w:bookmarkEnd w:id="2"/>
-      <w:bookmarkEnd w:id="3"/>
-      <w:bookmarkEnd w:id="4"/>
-      <w:bookmarkEnd w:id="5"/>
-      <w:bookmarkEnd w:id="6"/>
-    </w:p>
-    <w:p>
-      <w:pPr>
-        <w:pStyle w:val="Coverdisclaimer"/>
-      </w:pPr>
-    </w:p>
-    <w:p>
-      <w:pPr>
-        <w:pStyle w:val="Coverdisclaimer"/>
-      </w:pPr>
-    </w:p>
-    <w:p>
-      <w:pPr>
-        <w:pStyle w:val="Coverdisclaimer"/>
-      </w:pPr>
     </w:p>
     <w:p>
       <w:pPr>
@@ -118,8 +304,16 @@
         <w:rPr>
           <w:rStyle w:val="Restrictedstatisticstextforpublicationreleases"/>
         </w:rPr>
-        <w:t>RESTRICTED STATISTICS: embargoed to 09:30 dd/mm/yyyy</w:t>
+        <w:t>RESTRICTED STATISTICS: embargoed to 09:30 dd/mm/</w:t>
       </w:r>
+      <w:proofErr w:type="spellStart"/>
+      <w:r>
+        <w:rPr>
+          <w:rStyle w:val="Restrictedstatisticstextforpublicationreleases"/>
+        </w:rPr>
+        <w:t>yyyy</w:t>
+      </w:r>
+      <w:proofErr w:type="spellEnd"/>
     </w:p>
     <w:p>
       <w:pPr>
@@ -162,7 +356,7 @@
         </w:rPr>
         <w:lastRenderedPageBreak/>
         <w:drawing>
-          <wp:inline distT="0" distB="0" distL="0" distR="0" wp14:anchorId="3EBE9085" wp14:editId="2FBB1250">
+          <wp:inline distT="0" distB="0" distL="0" distR="0" wp14:anchorId="19AA542E" wp14:editId="366C2ACC">
             <wp:extent cx="5759450" cy="1094105"/>
             <wp:effectExtent l="0" t="0" r="0" b="0"/>
             <wp:docPr id="5" name="Picture 5" descr="Alternative format options icons showing, translations, easy read, BSL, audio, large print and Braille."/>
@@ -220,7 +414,7 @@
           <w:noProof/>
         </w:rPr>
         <w:drawing>
-          <wp:inline distT="0" distB="0" distL="0" distR="0" wp14:anchorId="36BA524B" wp14:editId="0B7CB125">
+          <wp:inline distT="0" distB="0" distL="0" distR="0" wp14:anchorId="6EB2B5E3" wp14:editId="3B833D62">
             <wp:extent cx="277327" cy="273579"/>
             <wp:effectExtent l="0" t="0" r="8890" b="0"/>
             <wp:docPr id="9" name="Picture 9">
@@ -296,7 +490,7 @@
           <w:noProof/>
         </w:rPr>
         <w:drawing>
-          <wp:inline distT="0" distB="0" distL="0" distR="0" wp14:anchorId="376B8491" wp14:editId="594D748A">
+          <wp:inline distT="0" distB="0" distL="0" distR="0" wp14:anchorId="5B006013" wp14:editId="35A95088">
             <wp:extent cx="277327" cy="277327"/>
             <wp:effectExtent l="0" t="0" r="8890" b="8890"/>
             <wp:docPr id="8" name="Picture 8">
@@ -389,7 +583,10 @@
         <w:t>© Public Health Scotland</w:t>
       </w:r>
       <w:r>
-        <w:t xml:space="preserve"> YYYY</w:t>
+        <w:t xml:space="preserve"> </w:t>
+      </w:r>
+      <w:r>
+        <w:t>2024</w:t>
       </w:r>
     </w:p>
     <w:p>
@@ -406,7 +603,7 @@
           <w:noProof/>
         </w:rPr>
         <w:drawing>
-          <wp:inline distT="0" distB="0" distL="0" distR="0" wp14:anchorId="77564F55" wp14:editId="452E581B">
+          <wp:inline distT="0" distB="0" distL="0" distR="0" wp14:anchorId="22AA4433" wp14:editId="7907270D">
             <wp:extent cx="899618" cy="429326"/>
             <wp:effectExtent l="0" t="0" r="0" b="0"/>
             <wp:docPr id="305935205" name="Picture 305935205" descr="Open Government Licence logo"/>
@@ -481,7 +678,7 @@
           <w:rStyle w:val="Hyperlink"/>
         </w:rPr>
       </w:pPr>
-      <w:bookmarkStart w:id="13" w:name="_Hlk87523849"/>
+      <w:bookmarkStart w:id="19" w:name="_Hlk87523849"/>
       <w:r>
         <w:t xml:space="preserve">For more information, visit </w:t>
       </w:r>
@@ -516,7 +713,7 @@
           <w:noProof/>
         </w:rPr>
         <w:drawing>
-          <wp:inline distT="0" distB="0" distL="0" distR="0" wp14:anchorId="1DF6D0C3" wp14:editId="20B39139">
+          <wp:inline distT="0" distB="0" distL="0" distR="0" wp14:anchorId="2272055A" wp14:editId="0B440944">
             <wp:extent cx="1037683" cy="885458"/>
             <wp:effectExtent l="0" t="0" r="0" b="0"/>
             <wp:docPr id="6" name="Picture 6" descr="Plain English Campaign logo"/>
@@ -595,7 +792,7 @@
         <w:t xml:space="preserve"> </w:t>
       </w:r>
     </w:p>
-    <w:bookmarkEnd w:id="13"/>
+    <w:bookmarkEnd w:id="19"/>
     <w:p>
       <w:pPr>
         <w:rPr>
@@ -642,27 +839,8 @@
       </w:r>
     </w:p>
     <w:p>
-      <w:hyperlink r:id="rId24" w:history="1">
-        <w:r>
-          <w:rPr>
-            <w:rStyle w:val="Hyperlink"/>
-          </w:rPr>
-          <w:t>Accredited official statistics</w:t>
-        </w:r>
-      </w:hyperlink>
       <w:r>
-        <w:t xml:space="preserve"> are called National Statistics in the </w:t>
-      </w:r>
-      <w:hyperlink r:id="rId25" w:history="1">
-        <w:r>
-          <w:rPr>
-            <w:rStyle w:val="Hyperlink"/>
-          </w:rPr>
-          <w:t>Statistics and Registration Service Act 2007</w:t>
-        </w:r>
-      </w:hyperlink>
-      <w:r>
-        <w:t>.</w:t>
+        <w:t>Accredited official statistics are called National Statistics in the Statistics and Registration Service Act 2007.</w:t>
       </w:r>
       <w:r>
         <w:t xml:space="preserve"> Accredited </w:t>
@@ -685,7 +863,13 @@
     </w:p>
     <w:p>
       <w:r>
-        <w:t>All official statistics should comply with the UK Statistics Authority’s Code of Practice which promotes the production and dissemination of official statistics that inform decision making.</w:t>
+        <w:t>All official statistics should comply with the UK Statistics Authority</w:t>
+      </w:r>
+      <w:r>
+        <w:t>'</w:t>
+      </w:r>
+      <w:r>
+        <w:t>s Code of Practice which promotes the production and dissemination of official statistics that inform decision making.</w:t>
       </w:r>
     </w:p>
     <w:p>
@@ -701,19 +885,19 @@
     </w:p>
     <w:p>
       <w:r>
-        <w:t>These official statistics were independently reviewed by the Office for Statistics Regulation in</w:t>
+        <w:t xml:space="preserve">These accredited official statistics were independently reviewed by the Office for Statistics Regulation in </w:t>
       </w:r>
       <w:r>
-        <w:t xml:space="preserve"> April 2013</w:t>
+        <w:t xml:space="preserve">April 2013. </w:t>
       </w:r>
       <w:r>
-        <w:t>. They comply with the standards of trustworthiness, quality and value in the Code of Practice for Statistics and should be labelled ‘</w:t>
+        <w:t xml:space="preserve">They comply with the standards of trustworthiness, quality and value in the Code of Practice for Statistics and should be labelled </w:t>
       </w:r>
       <w:r>
-        <w:t>A</w:t>
+        <w:t>'</w:t>
       </w:r>
       <w:r>
-        <w:t>ccredited official statistics</w:t>
+        <w:t>accredited official statistics</w:t>
       </w:r>
       <w:r>
         <w:t>'.</w:t>
@@ -731,20 +915,20 @@
         </w:rPr>
         <w:t xml:space="preserve">Our statistical practice is regulated by the Office for Statistics Regulation (OSR). OSR sets the standards of trustworthiness, quality and value in the </w:t>
       </w:r>
-      <w:hyperlink r:id="rId26" w:history="1">
-        <w:r>
-          <w:rPr>
-            <w:rStyle w:val="Hyperlink"/>
-            <w:lang w:eastAsia="en-GB"/>
-          </w:rPr>
-          <w:t>Code of Practice for Statistics</w:t>
-        </w:r>
-      </w:hyperlink>
       <w:r>
         <w:rPr>
           <w:lang w:eastAsia="en-GB"/>
         </w:rPr>
-        <w:t xml:space="preserve"> that all producers of official statistics should adhere to. You are welcome to contact us directly with any comments about how we meet these standards.</w:t>
+        <w:t>Code of Practice for Statistics</w:t>
+      </w:r>
+      <w:r>
+        <w:t xml:space="preserve"> that</w:t>
+      </w:r>
+      <w:r>
+        <w:rPr>
+          <w:lang w:eastAsia="en-GB"/>
+        </w:rPr>
+        <w:t xml:space="preserve"> all producers of official statistics should adhere to. You are welcome to contact us directly with any comments about how we meet these standards.</w:t>
       </w:r>
     </w:p>
     <w:p>
@@ -753,13 +937,14 @@
           <w:lang w:eastAsia="en-GB"/>
         </w:rPr>
       </w:pPr>
+      <w:bookmarkStart w:id="20" w:name="_Hlk157784571"/>
       <w:r>
         <w:rPr>
           <w:lang w:eastAsia="en-GB"/>
         </w:rPr>
         <w:t xml:space="preserve">Alternatively, you can contact OSR by emailing </w:t>
       </w:r>
-      <w:hyperlink r:id="rId27" w:history="1">
+      <w:hyperlink r:id="rId24" w:history="1">
         <w:r>
           <w:rPr>
             <w:rStyle w:val="Hyperlink"/>
@@ -778,9 +963,18 @@
         <w:rPr>
           <w:lang w:eastAsia="en-GB"/>
         </w:rPr>
-        <w:t xml:space="preserve">or via the </w:t>
+        <w:t xml:space="preserve">or </w:t>
       </w:r>
-      <w:hyperlink r:id="rId28" w:history="1">
+      <w:r>
+        <w:t>through</w:t>
+      </w:r>
+      <w:r>
+        <w:rPr>
+          <w:lang w:eastAsia="en-GB"/>
+        </w:rPr>
+        <w:t xml:space="preserve"> the </w:t>
+      </w:r>
+      <w:hyperlink r:id="rId25" w:history="1">
         <w:r>
           <w:rPr>
             <w:rStyle w:val="Hyperlink"/>
@@ -797,15 +991,28 @@
       </w:r>
     </w:p>
     <w:p>
+      <w:bookmarkStart w:id="21" w:name="_Hlk157784601"/>
+      <w:bookmarkEnd w:id="20"/>
       <w:r>
-        <w:t xml:space="preserve">Find out more about the Code of Practice by visiting the </w:t>
+        <w:t xml:space="preserve">Visit the UK Statistics Authority website for more information about the </w:t>
       </w:r>
-      <w:hyperlink r:id="rId29" w:history="1">
+      <w:hyperlink r:id="rId26" w:history="1">
         <w:r>
           <w:rPr>
             <w:rStyle w:val="Hyperlink"/>
           </w:rPr>
-          <w:t>UK Statistics Authority website</w:t>
+          <w:t>Code of Practice</w:t>
+        </w:r>
+      </w:hyperlink>
+      <w:r>
+        <w:t xml:space="preserve"> and </w:t>
+      </w:r>
+      <w:hyperlink r:id="rId27" w:anchor="pid-accredited-official-statistics" w:history="1">
+        <w:r>
+          <w:rPr>
+            <w:rStyle w:val="Hyperlink"/>
+          </w:rPr>
+          <w:t>Accredited official statistics</w:t>
         </w:r>
       </w:hyperlink>
       <w:r>
@@ -813,54 +1020,23 @@
       </w:r>
     </w:p>
     <w:p>
+      <w:bookmarkStart w:id="22" w:name="_Hlk157784554"/>
+      <w:bookmarkEnd w:id="21"/>
       <w:r>
-        <w:t xml:space="preserve">Find out more about </w:t>
+        <w:t xml:space="preserve">Visit our website for </w:t>
       </w:r>
-      <w:r>
-        <w:t xml:space="preserve">Accredited </w:t>
-      </w:r>
-      <w:r>
-        <w:t>o</w:t>
-      </w:r>
-      <w:r>
-        <w:t xml:space="preserve">fficial </w:t>
-      </w:r>
-      <w:r>
-        <w:t>s</w:t>
-      </w:r>
-      <w:r>
-        <w:t>tatistics</w:t>
-      </w:r>
-      <w:r>
-        <w:t xml:space="preserve"> on the </w:t>
-      </w:r>
-      <w:hyperlink r:id="rId30" w:anchor="pid-accredited-official-statistics" w:history="1">
+      <w:hyperlink r:id="rId28" w:history="1">
         <w:r>
           <w:rPr>
             <w:rStyle w:val="Hyperlink"/>
           </w:rPr>
-          <w:t>UK Statistics Authority website</w:t>
+          <w:t>further information about our statistics and PHS as an Official Statistics producer.</w:t>
         </w:r>
       </w:hyperlink>
-      <w:r>
-        <w:t>.</w:t>
-      </w:r>
     </w:p>
-    <w:p>
-      <w:hyperlink r:id="rId31" w:history="1">
-        <w:r>
-          <w:rPr>
-            <w:rStyle w:val="Hyperlink"/>
-          </w:rPr>
-          <w:t>Further information about our statistics and PHS as an Official Statistics producer.</w:t>
-        </w:r>
-      </w:hyperlink>
-      <w:r>
-        <w:t xml:space="preserve"> </w:t>
-      </w:r>
-    </w:p>
+    <w:bookmarkEnd w:id="22"/>
+    <w:p/>
     <w:sectPr>
-      <w:footerReference w:type="default" r:id="rId32"/>
       <w:footnotePr>
         <w:numFmt w:val="lowerRoman"/>
       </w:footnotePr>
@@ -877,7 +1053,7 @@
 </file>
 
 <file path=word/endnotes.xml><?xml version="1.0" encoding="utf-8"?>
-<w:endnotes xmlns:wpc="http://schemas.microsoft.com/office/word/2010/wordprocessingCanvas" xmlns:cx="http://schemas.microsoft.com/office/drawing/2014/chartex" xmlns:cx1="http://schemas.microsoft.com/office/drawing/2015/9/8/chartex" xmlns:cx2="http://schemas.microsoft.com/office/drawing/2015/10/21/chartex" xmlns:cx3="http://schemas.microsoft.com/office/drawing/2016/5/9/chartex" xmlns:cx4="http://schemas.microsoft.com/office/drawing/2016/5/10/chartex" xmlns:cx5="http://schemas.microsoft.com/office/drawing/2016/5/11/chartex" xmlns:cx6="http://schemas.microsoft.com/office/drawing/2016/5/12/chartex" xmlns:cx7="http://schemas.microsoft.com/office/drawing/2016/5/13/chartex" xmlns:cx8="http://schemas.microsoft.com/office/drawing/2016/5/14/chartex" xmlns:mc="http://schemas.openxmlformats.org/markup-compatibility/2006" xmlns:aink="http://schemas.microsoft.com/office/drawing/2016/ink" xmlns:am3d="http://schemas.microsoft.com/office/drawing/2017/model3d" xmlns:o="urn:schemas-microsoft-com:office:office" xmlns:oel="http://schemas.microsoft.com/office/2019/extlst" xmlns:r="http://schemas.openxmlformats.org/officeDocument/2006/relationships" xmlns:m="http://schemas.openxmlformats.org/officeDocument/2006/math" xmlns:v="urn:schemas-microsoft-com:vml" xmlns:wp14="http://schemas.microsoft.com/office/word/2010/wordprocessingDrawing" xmlns:wp="http://schemas.openxmlformats.org/drawingml/2006/wordprocessingDrawing" xmlns:w10="urn:schemas-microsoft-com:office:word" xmlns:w="http://schemas.openxmlformats.org/wordprocessingml/2006/main" xmlns:w14="http://schemas.microsoft.com/office/word/2010/wordml" xmlns:w15="http://schemas.microsoft.com/office/word/2012/wordml" xmlns:w16cex="http://schemas.microsoft.com/office/word/2018/wordml/cex" xmlns:w16cid="http://schemas.microsoft.com/office/word/2016/wordml/cid" xmlns:w16="http://schemas.microsoft.com/office/word/2018/wordml" xmlns:w16sdtdh="http://schemas.microsoft.com/office/word/2020/wordml/sdtdatahash" xmlns:w16se="http://schemas.microsoft.com/office/word/2015/wordml/symex" xmlns:wpg="http://schemas.microsoft.com/office/word/2010/wordprocessingGroup" xmlns:wpi="http://schemas.microsoft.com/office/word/2010/wordprocessingInk" xmlns:wne="http://schemas.microsoft.com/office/word/2006/wordml" xmlns:wps="http://schemas.microsoft.com/office/word/2010/wordprocessingShape" mc:Ignorable="w14 w15 w16se w16cid w16 w16cex w16sdtdh wp14">
+<w:endnotes xmlns:wpc="http://schemas.microsoft.com/office/word/2010/wordprocessingCanvas" xmlns:cx="http://schemas.microsoft.com/office/drawing/2014/chartex" xmlns:cx1="http://schemas.microsoft.com/office/drawing/2015/9/8/chartex" xmlns:cx2="http://schemas.microsoft.com/office/drawing/2015/10/21/chartex" xmlns:cx3="http://schemas.microsoft.com/office/drawing/2016/5/9/chartex" xmlns:cx4="http://schemas.microsoft.com/office/drawing/2016/5/10/chartex" xmlns:cx5="http://schemas.microsoft.com/office/drawing/2016/5/11/chartex" xmlns:cx6="http://schemas.microsoft.com/office/drawing/2016/5/12/chartex" xmlns:cx7="http://schemas.microsoft.com/office/drawing/2016/5/13/chartex" xmlns:cx8="http://schemas.microsoft.com/office/drawing/2016/5/14/chartex" xmlns:mc="http://schemas.openxmlformats.org/markup-compatibility/2006" xmlns:aink="http://schemas.microsoft.com/office/drawing/2016/ink" xmlns:am3d="http://schemas.microsoft.com/office/drawing/2017/model3d" xmlns:o="urn:schemas-microsoft-com:office:office" xmlns:oel="http://schemas.microsoft.com/office/2019/extlst" xmlns:r="http://schemas.openxmlformats.org/officeDocument/2006/relationships" xmlns:m="http://schemas.openxmlformats.org/officeDocument/2006/math" xmlns:v="urn:schemas-microsoft-com:vml" xmlns:wp14="http://schemas.microsoft.com/office/word/2010/wordprocessingDrawing" xmlns:wp="http://schemas.openxmlformats.org/drawingml/2006/wordprocessingDrawing" xmlns:w10="urn:schemas-microsoft-com:office:word" xmlns:w="http://schemas.openxmlformats.org/wordprocessingml/2006/main" xmlns:w14="http://schemas.microsoft.com/office/word/2010/wordml" xmlns:w15="http://schemas.microsoft.com/office/word/2012/wordml" xmlns:w16cex="http://schemas.microsoft.com/office/word/2018/wordml/cex" xmlns:w16cid="http://schemas.microsoft.com/office/word/2016/wordml/cid" xmlns:w16="http://schemas.microsoft.com/office/word/2018/wordml" xmlns:w16du="http://schemas.microsoft.com/office/word/2023/wordml/word16du" xmlns:w16sdtdh="http://schemas.microsoft.com/office/word/2020/wordml/sdtdatahash" xmlns:w16se="http://schemas.microsoft.com/office/word/2015/wordml/symex" xmlns:wpg="http://schemas.microsoft.com/office/word/2010/wordprocessingGroup" xmlns:wpi="http://schemas.microsoft.com/office/word/2010/wordprocessingInk" xmlns:wne="http://schemas.microsoft.com/office/word/2006/wordml" xmlns:wps="http://schemas.microsoft.com/office/word/2010/wordprocessingShape" mc:Ignorable="w14 w15 w16se w16cid w16 w16cex w16sdtdh w16du wp14">
   <w:endnote w:type="separator" w:id="-1">
     <w:p>
       <w:pPr>
@@ -892,7 +1068,7 @@
 </file>
 
 <file path=word/footer1.xml><?xml version="1.0" encoding="utf-8"?>
-<w:ftr xmlns:wpc="http://schemas.microsoft.com/office/word/2010/wordprocessingCanvas" xmlns:cx="http://schemas.microsoft.com/office/drawing/2014/chartex" xmlns:cx1="http://schemas.microsoft.com/office/drawing/2015/9/8/chartex" xmlns:cx2="http://schemas.microsoft.com/office/drawing/2015/10/21/chartex" xmlns:cx3="http://schemas.microsoft.com/office/drawing/2016/5/9/chartex" xmlns:cx4="http://schemas.microsoft.com/office/drawing/2016/5/10/chartex" xmlns:cx5="http://schemas.microsoft.com/office/drawing/2016/5/11/chartex" xmlns:cx6="http://schemas.microsoft.com/office/drawing/2016/5/12/chartex" xmlns:cx7="http://schemas.microsoft.com/office/drawing/2016/5/13/chartex" xmlns:cx8="http://schemas.microsoft.com/office/drawing/2016/5/14/chartex" xmlns:mc="http://schemas.openxmlformats.org/markup-compatibility/2006" xmlns:aink="http://schemas.microsoft.com/office/drawing/2016/ink" xmlns:am3d="http://schemas.microsoft.com/office/drawing/2017/model3d" xmlns:o="urn:schemas-microsoft-com:office:office" xmlns:oel="http://schemas.microsoft.com/office/2019/extlst" xmlns:r="http://schemas.openxmlformats.org/officeDocument/2006/relationships" xmlns:m="http://schemas.openxmlformats.org/officeDocument/2006/math" xmlns:v="urn:schemas-microsoft-com:vml" xmlns:wp14="http://schemas.microsoft.com/office/word/2010/wordprocessingDrawing" xmlns:wp="http://schemas.openxmlformats.org/drawingml/2006/wordprocessingDrawing" xmlns:w10="urn:schemas-microsoft-com:office:word" xmlns:w="http://schemas.openxmlformats.org/wordprocessingml/2006/main" xmlns:w14="http://schemas.microsoft.com/office/word/2010/wordml" xmlns:w15="http://schemas.microsoft.com/office/word/2012/wordml" xmlns:w16cex="http://schemas.microsoft.com/office/word/2018/wordml/cex" xmlns:w16cid="http://schemas.microsoft.com/office/word/2016/wordml/cid" xmlns:w16="http://schemas.microsoft.com/office/word/2018/wordml" xmlns:w16sdtdh="http://schemas.microsoft.com/office/word/2020/wordml/sdtdatahash" xmlns:w16se="http://schemas.microsoft.com/office/word/2015/wordml/symex" xmlns:wpg="http://schemas.microsoft.com/office/word/2010/wordprocessingGroup" xmlns:wpi="http://schemas.microsoft.com/office/word/2010/wordprocessingInk" xmlns:wne="http://schemas.microsoft.com/office/word/2006/wordml" xmlns:wps="http://schemas.microsoft.com/office/word/2010/wordprocessingShape" mc:Ignorable="w14 w15 w16se w16cid w16 w16cex w16sdtdh wp14">
+<w:ftr xmlns:wpc="http://schemas.microsoft.com/office/word/2010/wordprocessingCanvas" xmlns:cx="http://schemas.microsoft.com/office/drawing/2014/chartex" xmlns:cx1="http://schemas.microsoft.com/office/drawing/2015/9/8/chartex" xmlns:cx2="http://schemas.microsoft.com/office/drawing/2015/10/21/chartex" xmlns:cx3="http://schemas.microsoft.com/office/drawing/2016/5/9/chartex" xmlns:cx4="http://schemas.microsoft.com/office/drawing/2016/5/10/chartex" xmlns:cx5="http://schemas.microsoft.com/office/drawing/2016/5/11/chartex" xmlns:cx6="http://schemas.microsoft.com/office/drawing/2016/5/12/chartex" xmlns:cx7="http://schemas.microsoft.com/office/drawing/2016/5/13/chartex" xmlns:cx8="http://schemas.microsoft.com/office/drawing/2016/5/14/chartex" xmlns:mc="http://schemas.openxmlformats.org/markup-compatibility/2006" xmlns:aink="http://schemas.microsoft.com/office/drawing/2016/ink" xmlns:am3d="http://schemas.microsoft.com/office/drawing/2017/model3d" xmlns:o="urn:schemas-microsoft-com:office:office" xmlns:oel="http://schemas.microsoft.com/office/2019/extlst" xmlns:r="http://schemas.openxmlformats.org/officeDocument/2006/relationships" xmlns:m="http://schemas.openxmlformats.org/officeDocument/2006/math" xmlns:v="urn:schemas-microsoft-com:vml" xmlns:wp14="http://schemas.microsoft.com/office/word/2010/wordprocessingDrawing" xmlns:wp="http://schemas.openxmlformats.org/drawingml/2006/wordprocessingDrawing" xmlns:w10="urn:schemas-microsoft-com:office:word" xmlns:w="http://schemas.openxmlformats.org/wordprocessingml/2006/main" xmlns:w14="http://schemas.microsoft.com/office/word/2010/wordml" xmlns:w15="http://schemas.microsoft.com/office/word/2012/wordml" xmlns:w16cex="http://schemas.microsoft.com/office/word/2018/wordml/cex" xmlns:w16cid="http://schemas.microsoft.com/office/word/2016/wordml/cid" xmlns:w16="http://schemas.microsoft.com/office/word/2018/wordml" xmlns:w16du="http://schemas.microsoft.com/office/word/2023/wordml/word16du" xmlns:w16sdtdh="http://schemas.microsoft.com/office/word/2020/wordml/sdtdatahash" xmlns:w16se="http://schemas.microsoft.com/office/word/2015/wordml/symex" xmlns:wpg="http://schemas.microsoft.com/office/word/2010/wordprocessingGroup" xmlns:wpi="http://schemas.microsoft.com/office/word/2010/wordprocessingInk" xmlns:wne="http://schemas.microsoft.com/office/word/2006/wordml" xmlns:wps="http://schemas.microsoft.com/office/word/2010/wordprocessingShape" mc:Ignorable="w14 w15 w16se w16cid w16 w16cex w16sdtdh w16du wp14">
   <w:sdt>
     <w:sdtPr>
       <w:id w:val="-843395953"/>
@@ -901,6 +1077,7 @@
         <w:docPartUnique/>
       </w:docPartObj>
     </w:sdtPr>
+    <w:sdtEndPr/>
     <w:sdtContent>
       <w:p>
         <w:pPr>
@@ -934,17 +1111,17 @@
 </file>
 
 <file path=word/footer2.xml><?xml version="1.0" encoding="utf-8"?>
-<w:ftr xmlns:wpc="http://schemas.microsoft.com/office/word/2010/wordprocessingCanvas" xmlns:cx="http://schemas.microsoft.com/office/drawing/2014/chartex" xmlns:cx1="http://schemas.microsoft.com/office/drawing/2015/9/8/chartex" xmlns:cx2="http://schemas.microsoft.com/office/drawing/2015/10/21/chartex" xmlns:cx3="http://schemas.microsoft.com/office/drawing/2016/5/9/chartex" xmlns:cx4="http://schemas.microsoft.com/office/drawing/2016/5/10/chartex" xmlns:cx5="http://schemas.microsoft.com/office/drawing/2016/5/11/chartex" xmlns:cx6="http://schemas.microsoft.com/office/drawing/2016/5/12/chartex" xmlns:cx7="http://schemas.microsoft.com/office/drawing/2016/5/13/chartex" xmlns:cx8="http://schemas.microsoft.com/office/drawing/2016/5/14/chartex" xmlns:mc="http://schemas.openxmlformats.org/markup-compatibility/2006" xmlns:aink="http://schemas.microsoft.com/office/drawing/2016/ink" xmlns:am3d="http://schemas.microsoft.com/office/drawing/2017/model3d" xmlns:o="urn:schemas-microsoft-com:office:office" xmlns:oel="http://schemas.microsoft.com/office/2019/extlst" xmlns:r="http://schemas.openxmlformats.org/officeDocument/2006/relationships" xmlns:m="http://schemas.openxmlformats.org/officeDocument/2006/math" xmlns:v="urn:schemas-microsoft-com:vml" xmlns:wp14="http://schemas.microsoft.com/office/word/2010/wordprocessingDrawing" xmlns:wp="http://schemas.openxmlformats.org/drawingml/2006/wordprocessingDrawing" xmlns:w10="urn:schemas-microsoft-com:office:word" xmlns:w="http://schemas.openxmlformats.org/wordprocessingml/2006/main" xmlns:w14="http://schemas.microsoft.com/office/word/2010/wordml" xmlns:w15="http://schemas.microsoft.com/office/word/2012/wordml" xmlns:w16cex="http://schemas.microsoft.com/office/word/2018/wordml/cex" xmlns:w16cid="http://schemas.microsoft.com/office/word/2016/wordml/cid" xmlns:w16="http://schemas.microsoft.com/office/word/2018/wordml" xmlns:w16sdtdh="http://schemas.microsoft.com/office/word/2020/wordml/sdtdatahash" xmlns:w16se="http://schemas.microsoft.com/office/word/2015/wordml/symex" xmlns:wpg="http://schemas.microsoft.com/office/word/2010/wordprocessingGroup" xmlns:wpi="http://schemas.microsoft.com/office/word/2010/wordprocessingInk" xmlns:wne="http://schemas.microsoft.com/office/word/2006/wordml" xmlns:wps="http://schemas.microsoft.com/office/word/2010/wordprocessingShape" mc:Ignorable="w14 w15 w16se w16cid w16 w16cex w16sdtdh wp14">
+<w:ftr xmlns:wpc="http://schemas.microsoft.com/office/word/2010/wordprocessingCanvas" xmlns:cx="http://schemas.microsoft.com/office/drawing/2014/chartex" xmlns:cx1="http://schemas.microsoft.com/office/drawing/2015/9/8/chartex" xmlns:cx2="http://schemas.microsoft.com/office/drawing/2015/10/21/chartex" xmlns:cx3="http://schemas.microsoft.com/office/drawing/2016/5/9/chartex" xmlns:cx4="http://schemas.microsoft.com/office/drawing/2016/5/10/chartex" xmlns:cx5="http://schemas.microsoft.com/office/drawing/2016/5/11/chartex" xmlns:cx6="http://schemas.microsoft.com/office/drawing/2016/5/12/chartex" xmlns:cx7="http://schemas.microsoft.com/office/drawing/2016/5/13/chartex" xmlns:cx8="http://schemas.microsoft.com/office/drawing/2016/5/14/chartex" xmlns:mc="http://schemas.openxmlformats.org/markup-compatibility/2006" xmlns:aink="http://schemas.microsoft.com/office/drawing/2016/ink" xmlns:am3d="http://schemas.microsoft.com/office/drawing/2017/model3d" xmlns:o="urn:schemas-microsoft-com:office:office" xmlns:oel="http://schemas.microsoft.com/office/2019/extlst" xmlns:r="http://schemas.openxmlformats.org/officeDocument/2006/relationships" xmlns:m="http://schemas.openxmlformats.org/officeDocument/2006/math" xmlns:v="urn:schemas-microsoft-com:vml" xmlns:wp14="http://schemas.microsoft.com/office/word/2010/wordprocessingDrawing" xmlns:wp="http://schemas.openxmlformats.org/drawingml/2006/wordprocessingDrawing" xmlns:w10="urn:schemas-microsoft-com:office:word" xmlns:w="http://schemas.openxmlformats.org/wordprocessingml/2006/main" xmlns:w14="http://schemas.microsoft.com/office/word/2010/wordml" xmlns:w15="http://schemas.microsoft.com/office/word/2012/wordml" xmlns:w16cex="http://schemas.microsoft.com/office/word/2018/wordml/cex" xmlns:w16cid="http://schemas.microsoft.com/office/word/2016/wordml/cid" xmlns:w16="http://schemas.microsoft.com/office/word/2018/wordml" xmlns:w16du="http://schemas.microsoft.com/office/word/2023/wordml/word16du" xmlns:w16sdtdh="http://schemas.microsoft.com/office/word/2020/wordml/sdtdatahash" xmlns:w16se="http://schemas.microsoft.com/office/word/2015/wordml/symex" xmlns:wpg="http://schemas.microsoft.com/office/word/2010/wordprocessingGroup" xmlns:wpi="http://schemas.microsoft.com/office/word/2010/wordprocessingInk" xmlns:wne="http://schemas.microsoft.com/office/word/2006/wordml" xmlns:wps="http://schemas.microsoft.com/office/word/2010/wordprocessingShape" mc:Ignorable="w14 w15 w16se w16cid w16 w16cex w16sdtdh w16du wp14">
   <w:p>
     <w:pPr>
       <w:pStyle w:val="Coverfooter"/>
     </w:pPr>
-    <w:bookmarkStart w:id="7" w:name="_Hlk69468892"/>
-    <w:bookmarkStart w:id="8" w:name="_Hlk69468893"/>
-    <w:bookmarkStart w:id="9" w:name="_Hlk69468894"/>
-    <w:bookmarkStart w:id="10" w:name="_Hlk69468895"/>
-    <w:bookmarkStart w:id="11" w:name="_Hlk69468896"/>
-    <w:bookmarkStart w:id="12" w:name="_Hlk69468897"/>
+    <w:bookmarkStart w:id="13" w:name="_Hlk69468892"/>
+    <w:bookmarkStart w:id="14" w:name="_Hlk69468893"/>
+    <w:bookmarkStart w:id="15" w:name="_Hlk69468894"/>
+    <w:bookmarkStart w:id="16" w:name="_Hlk69468895"/>
+    <w:bookmarkStart w:id="17" w:name="_Hlk69468896"/>
+    <w:bookmarkStart w:id="18" w:name="_Hlk69468897"/>
     <w:r>
       <w:rPr>
         <w:noProof/>
@@ -952,7 +1129,7 @@
       <mc:AlternateContent>
         <mc:Choice Requires="wps">
           <w:drawing>
-            <wp:anchor distT="0" distB="0" distL="114300" distR="114300" simplePos="0" relativeHeight="251680768" behindDoc="0" locked="0" layoutInCell="1" allowOverlap="1" wp14:anchorId="16F284D0" wp14:editId="70DDEA57">
+            <wp:anchor distT="0" distB="0" distL="114300" distR="114300" simplePos="0" relativeHeight="251680768" behindDoc="0" locked="0" layoutInCell="1" allowOverlap="1" wp14:anchorId="72CB2F9B" wp14:editId="77EE46D7">
               <wp:simplePos x="0" y="0"/>
               <wp:positionH relativeFrom="page">
                 <wp:posOffset>7038975</wp:posOffset>
@@ -1039,7 +1216,7 @@
         </mc:Choice>
         <mc:Fallback>
           <w:pict>
-            <v:rect w14:anchorId="16F284D0" id="Rectangle 3" o:spid="_x0000_s1026" alt="&quot;&quot;" style="position:absolute;margin-left:554.25pt;margin-top:-20pt;width:37.65pt;height:99.2pt;z-index:251680768;visibility:visible;mso-wrap-style:square;mso-width-percent:0;mso-height-percent:0;mso-wrap-distance-left:9pt;mso-wrap-distance-top:0;mso-wrap-distance-right:9pt;mso-wrap-distance-bottom:0;mso-position-horizontal:absolute;mso-position-horizontal-relative:page;mso-position-vertical:absolute;mso-position-vertical-relative:text;mso-width-percent:0;mso-height-percent:0;mso-width-relative:margin;mso-height-relative:margin;v-text-anchor:top" o:gfxdata="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" filled="f" stroked="f" strokeweight="1.25pt">
+            <v:rect w14:anchorId="72CB2F9B" id="Rectangle 3" o:spid="_x0000_s1027" alt="&quot;&quot;" style="position:absolute;margin-left:554.25pt;margin-top:-20pt;width:37.65pt;height:99.2pt;z-index:251680768;visibility:visible;mso-wrap-style:square;mso-width-percent:0;mso-height-percent:0;mso-wrap-distance-left:9pt;mso-wrap-distance-top:0;mso-wrap-distance-right:9pt;mso-wrap-distance-bottom:0;mso-position-horizontal:absolute;mso-position-horizontal-relative:page;mso-position-vertical:absolute;mso-position-vertical-relative:text;mso-width-percent:0;mso-height-percent:0;mso-width-relative:margin;mso-height-relative:margin;v-text-anchor:top" o:gfxdata="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" filled="f" stroked="f" strokeweight="1.25pt">
               <v:textbox style="layout-flow:vertical" inset=",,,4mm">
                 <w:txbxContent>
                   <w:p>
@@ -1082,7 +1259,7 @@
       <mc:AlternateContent>
         <mc:Choice Requires="wps">
           <w:drawing>
-            <wp:anchor distT="0" distB="0" distL="114300" distR="114300" simplePos="0" relativeHeight="251677696" behindDoc="1" locked="0" layoutInCell="1" allowOverlap="1" wp14:anchorId="0C73F016" wp14:editId="56CE45CC">
+            <wp:anchor distT="0" distB="0" distL="114300" distR="114300" simplePos="0" relativeHeight="251677696" behindDoc="1" locked="0" layoutInCell="1" allowOverlap="1" wp14:anchorId="0B2097ED" wp14:editId="7C710F46">
               <wp:simplePos x="0" y="0"/>
               <wp:positionH relativeFrom="page">
                 <wp:posOffset>0</wp:posOffset>
@@ -1180,7 +1357,7 @@
         </mc:Choice>
         <mc:Fallback>
           <w:pict>
-            <v:rect w14:anchorId="0C73F016" id="Rectangle 13" o:spid="_x0000_s1027" alt="&quot;&quot;" style="position:absolute;margin-left:0;margin-top:-19.95pt;width:595.3pt;height:99.2pt;z-index:-251638784;visibility:visible;mso-wrap-style:square;mso-width-percent:0;mso-height-percent:0;mso-wrap-distance-left:9pt;mso-wrap-distance-top:0;mso-wrap-distance-right:9pt;mso-wrap-distance-bottom:0;mso-position-horizontal:absolute;mso-position-horizontal-relative:page;mso-position-vertical:absolute;mso-position-vertical-relative:text;mso-width-percent:0;mso-height-percent:0;mso-width-relative:margin;mso-height-relative:margin;v-text-anchor:top" o:gfxdata="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" fillcolor="#43358b" stroked="f" strokeweight="1.25pt">
+            <v:rect w14:anchorId="0B2097ED" id="Rectangle 13" o:spid="_x0000_s1028" alt="&quot;&quot;" style="position:absolute;margin-left:0;margin-top:-19.95pt;width:595.3pt;height:99.2pt;z-index:-251638784;visibility:visible;mso-wrap-style:square;mso-width-percent:0;mso-height-percent:0;mso-wrap-distance-left:9pt;mso-wrap-distance-top:0;mso-wrap-distance-right:9pt;mso-wrap-distance-bottom:0;mso-position-horizontal:absolute;mso-position-horizontal-relative:page;mso-position-vertical:absolute;mso-position-vertical-relative:text;mso-width-percent:0;mso-height-percent:0;mso-width-relative:margin;mso-height-relative:margin;v-text-anchor:top" o:gfxdata="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" fillcolor="#43358b" stroked="f" strokeweight="1.25pt">
               <v:textbox style="layout-flow:vertical" inset=",,,4mm">
                 <w:txbxContent>
                   <w:p>
@@ -1211,18 +1388,18 @@
         </mc:Fallback>
       </mc:AlternateContent>
     </w:r>
-    <w:bookmarkEnd w:id="7"/>
-    <w:bookmarkEnd w:id="8"/>
-    <w:bookmarkEnd w:id="9"/>
-    <w:bookmarkEnd w:id="10"/>
-    <w:bookmarkEnd w:id="11"/>
-    <w:bookmarkEnd w:id="12"/>
+    <w:bookmarkEnd w:id="13"/>
+    <w:bookmarkEnd w:id="14"/>
+    <w:bookmarkEnd w:id="15"/>
+    <w:bookmarkEnd w:id="16"/>
+    <w:bookmarkEnd w:id="17"/>
+    <w:bookmarkEnd w:id="18"/>
   </w:p>
 </w:ftr>
 </file>
 
 <file path=word/footer3.xml><?xml version="1.0" encoding="utf-8"?>
-<w:ftr xmlns:wpc="http://schemas.microsoft.com/office/word/2010/wordprocessingCanvas" xmlns:cx="http://schemas.microsoft.com/office/drawing/2014/chartex" xmlns:cx1="http://schemas.microsoft.com/office/drawing/2015/9/8/chartex" xmlns:cx2="http://schemas.microsoft.com/office/drawing/2015/10/21/chartex" xmlns:cx3="http://schemas.microsoft.com/office/drawing/2016/5/9/chartex" xmlns:cx4="http://schemas.microsoft.com/office/drawing/2016/5/10/chartex" xmlns:cx5="http://schemas.microsoft.com/office/drawing/2016/5/11/chartex" xmlns:cx6="http://schemas.microsoft.com/office/drawing/2016/5/12/chartex" xmlns:cx7="http://schemas.microsoft.com/office/drawing/2016/5/13/chartex" xmlns:cx8="http://schemas.microsoft.com/office/drawing/2016/5/14/chartex" xmlns:mc="http://schemas.openxmlformats.org/markup-compatibility/2006" xmlns:aink="http://schemas.microsoft.com/office/drawing/2016/ink" xmlns:am3d="http://schemas.microsoft.com/office/drawing/2017/model3d" xmlns:o="urn:schemas-microsoft-com:office:office" xmlns:oel="http://schemas.microsoft.com/office/2019/extlst" xmlns:r="http://schemas.openxmlformats.org/officeDocument/2006/relationships" xmlns:m="http://schemas.openxmlformats.org/officeDocument/2006/math" xmlns:v="urn:schemas-microsoft-com:vml" xmlns:wp14="http://schemas.microsoft.com/office/word/2010/wordprocessingDrawing" xmlns:wp="http://schemas.openxmlformats.org/drawingml/2006/wordprocessingDrawing" xmlns:w10="urn:schemas-microsoft-com:office:word" xmlns:w="http://schemas.openxmlformats.org/wordprocessingml/2006/main" xmlns:w14="http://schemas.microsoft.com/office/word/2010/wordml" xmlns:w15="http://schemas.microsoft.com/office/word/2012/wordml" xmlns:w16cex="http://schemas.microsoft.com/office/word/2018/wordml/cex" xmlns:w16cid="http://schemas.microsoft.com/office/word/2016/wordml/cid" xmlns:w16="http://schemas.microsoft.com/office/word/2018/wordml" xmlns:w16sdtdh="http://schemas.microsoft.com/office/word/2020/wordml/sdtdatahash" xmlns:w16se="http://schemas.microsoft.com/office/word/2015/wordml/symex" xmlns:wpg="http://schemas.microsoft.com/office/word/2010/wordprocessingGroup" xmlns:wpi="http://schemas.microsoft.com/office/word/2010/wordprocessingInk" xmlns:wne="http://schemas.microsoft.com/office/word/2006/wordml" xmlns:wps="http://schemas.microsoft.com/office/word/2010/wordprocessingShape" mc:Ignorable="w14 w15 w16se w16cid w16 w16cex w16sdtdh wp14">
+<w:ftr xmlns:wpc="http://schemas.microsoft.com/office/word/2010/wordprocessingCanvas" xmlns:cx="http://schemas.microsoft.com/office/drawing/2014/chartex" xmlns:cx1="http://schemas.microsoft.com/office/drawing/2015/9/8/chartex" xmlns:cx2="http://schemas.microsoft.com/office/drawing/2015/10/21/chartex" xmlns:cx3="http://schemas.microsoft.com/office/drawing/2016/5/9/chartex" xmlns:cx4="http://schemas.microsoft.com/office/drawing/2016/5/10/chartex" xmlns:cx5="http://schemas.microsoft.com/office/drawing/2016/5/11/chartex" xmlns:cx6="http://schemas.microsoft.com/office/drawing/2016/5/12/chartex" xmlns:cx7="http://schemas.microsoft.com/office/drawing/2016/5/13/chartex" xmlns:cx8="http://schemas.microsoft.com/office/drawing/2016/5/14/chartex" xmlns:mc="http://schemas.openxmlformats.org/markup-compatibility/2006" xmlns:aink="http://schemas.microsoft.com/office/drawing/2016/ink" xmlns:am3d="http://schemas.microsoft.com/office/drawing/2017/model3d" xmlns:o="urn:schemas-microsoft-com:office:office" xmlns:oel="http://schemas.microsoft.com/office/2019/extlst" xmlns:r="http://schemas.openxmlformats.org/officeDocument/2006/relationships" xmlns:m="http://schemas.openxmlformats.org/officeDocument/2006/math" xmlns:v="urn:schemas-microsoft-com:vml" xmlns:wp14="http://schemas.microsoft.com/office/word/2010/wordprocessingDrawing" xmlns:wp="http://schemas.openxmlformats.org/drawingml/2006/wordprocessingDrawing" xmlns:w10="urn:schemas-microsoft-com:office:word" xmlns:w="http://schemas.openxmlformats.org/wordprocessingml/2006/main" xmlns:w14="http://schemas.microsoft.com/office/word/2010/wordml" xmlns:w15="http://schemas.microsoft.com/office/word/2012/wordml" xmlns:w16cex="http://schemas.microsoft.com/office/word/2018/wordml/cex" xmlns:w16cid="http://schemas.microsoft.com/office/word/2016/wordml/cid" xmlns:w16="http://schemas.microsoft.com/office/word/2018/wordml" xmlns:w16du="http://schemas.microsoft.com/office/word/2023/wordml/word16du" xmlns:w16sdtdh="http://schemas.microsoft.com/office/word/2020/wordml/sdtdatahash" xmlns:w16se="http://schemas.microsoft.com/office/word/2015/wordml/symex" xmlns:wpg="http://schemas.microsoft.com/office/word/2010/wordprocessingGroup" xmlns:wpi="http://schemas.microsoft.com/office/word/2010/wordprocessingInk" xmlns:wne="http://schemas.microsoft.com/office/word/2006/wordml" xmlns:wps="http://schemas.microsoft.com/office/word/2010/wordprocessingShape" mc:Ignorable="w14 w15 w16se w16cid w16 w16cex w16sdtdh w16du wp14">
   <w:sdt>
     <w:sdtPr>
       <w:id w:val="2118333990"/>
@@ -1231,6 +1408,7 @@
         <w:docPartUnique/>
       </w:docPartObj>
     </w:sdtPr>
+    <w:sdtEndPr/>
     <w:sdtContent>
       <w:p>
         <w:pPr>
@@ -1242,55 +1420,8 @@
 </w:ftr>
 </file>
 
-<file path=word/footer4.xml><?xml version="1.0" encoding="utf-8"?>
-<w:ftr xmlns:wpc="http://schemas.microsoft.com/office/word/2010/wordprocessingCanvas" xmlns:cx="http://schemas.microsoft.com/office/drawing/2014/chartex" xmlns:cx1="http://schemas.microsoft.com/office/drawing/2015/9/8/chartex" xmlns:cx2="http://schemas.microsoft.com/office/drawing/2015/10/21/chartex" xmlns:cx3="http://schemas.microsoft.com/office/drawing/2016/5/9/chartex" xmlns:cx4="http://schemas.microsoft.com/office/drawing/2016/5/10/chartex" xmlns:cx5="http://schemas.microsoft.com/office/drawing/2016/5/11/chartex" xmlns:cx6="http://schemas.microsoft.com/office/drawing/2016/5/12/chartex" xmlns:cx7="http://schemas.microsoft.com/office/drawing/2016/5/13/chartex" xmlns:cx8="http://schemas.microsoft.com/office/drawing/2016/5/14/chartex" xmlns:mc="http://schemas.openxmlformats.org/markup-compatibility/2006" xmlns:aink="http://schemas.microsoft.com/office/drawing/2016/ink" xmlns:am3d="http://schemas.microsoft.com/office/drawing/2017/model3d" xmlns:o="urn:schemas-microsoft-com:office:office" xmlns:oel="http://schemas.microsoft.com/office/2019/extlst" xmlns:r="http://schemas.openxmlformats.org/officeDocument/2006/relationships" xmlns:m="http://schemas.openxmlformats.org/officeDocument/2006/math" xmlns:v="urn:schemas-microsoft-com:vml" xmlns:wp14="http://schemas.microsoft.com/office/word/2010/wordprocessingDrawing" xmlns:wp="http://schemas.openxmlformats.org/drawingml/2006/wordprocessingDrawing" xmlns:w10="urn:schemas-microsoft-com:office:word" xmlns:w="http://schemas.openxmlformats.org/wordprocessingml/2006/main" xmlns:w14="http://schemas.microsoft.com/office/word/2010/wordml" xmlns:w15="http://schemas.microsoft.com/office/word/2012/wordml" xmlns:w16cex="http://schemas.microsoft.com/office/word/2018/wordml/cex" xmlns:w16cid="http://schemas.microsoft.com/office/word/2016/wordml/cid" xmlns:w16="http://schemas.microsoft.com/office/word/2018/wordml" xmlns:w16sdtdh="http://schemas.microsoft.com/office/word/2020/wordml/sdtdatahash" xmlns:w16se="http://schemas.microsoft.com/office/word/2015/wordml/symex" xmlns:wpg="http://schemas.microsoft.com/office/word/2010/wordprocessingGroup" xmlns:wpi="http://schemas.microsoft.com/office/word/2010/wordprocessingInk" xmlns:wne="http://schemas.microsoft.com/office/word/2006/wordml" xmlns:wps="http://schemas.microsoft.com/office/word/2010/wordprocessingShape" mc:Ignorable="w14 w15 w16se w16cid w16 w16cex w16sdtdh wp14">
-  <w:sdt>
-    <w:sdtPr>
-      <w:id w:val="-22475434"/>
-      <w:docPartObj>
-        <w:docPartGallery w:val="Page Numbers (Bottom of Page)"/>
-        <w:docPartUnique/>
-      </w:docPartObj>
-    </w:sdtPr>
-    <w:sdtContent>
-      <w:sdt>
-        <w:sdtPr>
-          <w:id w:val="-705557575"/>
-          <w:docPartObj>
-            <w:docPartGallery w:val="Page Numbers (Bottom of Page)"/>
-            <w:docPartUnique/>
-          </w:docPartObj>
-        </w:sdtPr>
-        <w:sdtContent>
-          <w:p>
-            <w:pPr>
-              <w:pStyle w:val="Pagenumbers"/>
-            </w:pPr>
-            <w:r>
-              <w:fldChar w:fldCharType="begin"/>
-            </w:r>
-            <w:r>
-              <w:instrText xml:space="preserve"> PAGE   \* MERGEFORMAT </w:instrText>
-            </w:r>
-            <w:r>
-              <w:fldChar w:fldCharType="separate"/>
-            </w:r>
-            <w:r>
-              <w:t>1</w:t>
-            </w:r>
-            <w:r>
-              <w:fldChar w:fldCharType="end"/>
-            </w:r>
-          </w:p>
-        </w:sdtContent>
-      </w:sdt>
-    </w:sdtContent>
-  </w:sdt>
-</w:ftr>
-</file>
-
 <file path=word/footnotes.xml><?xml version="1.0" encoding="utf-8"?>
-<w:footnotes xmlns:wpc="http://schemas.microsoft.com/office/word/2010/wordprocessingCanvas" xmlns:cx="http://schemas.microsoft.com/office/drawing/2014/chartex" xmlns:cx1="http://schemas.microsoft.com/office/drawing/2015/9/8/chartex" xmlns:cx2="http://schemas.microsoft.com/office/drawing/2015/10/21/chartex" xmlns:cx3="http://schemas.microsoft.com/office/drawing/2016/5/9/chartex" xmlns:cx4="http://schemas.microsoft.com/office/drawing/2016/5/10/chartex" xmlns:cx5="http://schemas.microsoft.com/office/drawing/2016/5/11/chartex" xmlns:cx6="http://schemas.microsoft.com/office/drawing/2016/5/12/chartex" xmlns:cx7="http://schemas.microsoft.com/office/drawing/2016/5/13/chartex" xmlns:cx8="http://schemas.microsoft.com/office/drawing/2016/5/14/chartex" xmlns:mc="http://schemas.openxmlformats.org/markup-compatibility/2006" xmlns:aink="http://schemas.microsoft.com/office/drawing/2016/ink" xmlns:am3d="http://schemas.microsoft.com/office/drawing/2017/model3d" xmlns:o="urn:schemas-microsoft-com:office:office" xmlns:oel="http://schemas.microsoft.com/office/2019/extlst" xmlns:r="http://schemas.openxmlformats.org/officeDocument/2006/relationships" xmlns:m="http://schemas.openxmlformats.org/officeDocument/2006/math" xmlns:v="urn:schemas-microsoft-com:vml" xmlns:wp14="http://schemas.microsoft.com/office/word/2010/wordprocessingDrawing" xmlns:wp="http://schemas.openxmlformats.org/drawingml/2006/wordprocessingDrawing" xmlns:w10="urn:schemas-microsoft-com:office:word" xmlns:w="http://schemas.openxmlformats.org/wordprocessingml/2006/main" xmlns:w14="http://schemas.microsoft.com/office/word/2010/wordml" xmlns:w15="http://schemas.microsoft.com/office/word/2012/wordml" xmlns:w16cex="http://schemas.microsoft.com/office/word/2018/wordml/cex" xmlns:w16cid="http://schemas.microsoft.com/office/word/2016/wordml/cid" xmlns:w16="http://schemas.microsoft.com/office/word/2018/wordml" xmlns:w16sdtdh="http://schemas.microsoft.com/office/word/2020/wordml/sdtdatahash" xmlns:w16se="http://schemas.microsoft.com/office/word/2015/wordml/symex" xmlns:wpg="http://schemas.microsoft.com/office/word/2010/wordprocessingGroup" xmlns:wpi="http://schemas.microsoft.com/office/word/2010/wordprocessingInk" xmlns:wne="http://schemas.microsoft.com/office/word/2006/wordml" xmlns:wps="http://schemas.microsoft.com/office/word/2010/wordprocessingShape" mc:Ignorable="w14 w15 w16se w16cid w16 w16cex w16sdtdh wp14">
+<w:footnotes xmlns:wpc="http://schemas.microsoft.com/office/word/2010/wordprocessingCanvas" xmlns:cx="http://schemas.microsoft.com/office/drawing/2014/chartex" xmlns:cx1="http://schemas.microsoft.com/office/drawing/2015/9/8/chartex" xmlns:cx2="http://schemas.microsoft.com/office/drawing/2015/10/21/chartex" xmlns:cx3="http://schemas.microsoft.com/office/drawing/2016/5/9/chartex" xmlns:cx4="http://schemas.microsoft.com/office/drawing/2016/5/10/chartex" xmlns:cx5="http://schemas.microsoft.com/office/drawing/2016/5/11/chartex" xmlns:cx6="http://schemas.microsoft.com/office/drawing/2016/5/12/chartex" xmlns:cx7="http://schemas.microsoft.com/office/drawing/2016/5/13/chartex" xmlns:cx8="http://schemas.microsoft.com/office/drawing/2016/5/14/chartex" xmlns:mc="http://schemas.openxmlformats.org/markup-compatibility/2006" xmlns:aink="http://schemas.microsoft.com/office/drawing/2016/ink" xmlns:am3d="http://schemas.microsoft.com/office/drawing/2017/model3d" xmlns:o="urn:schemas-microsoft-com:office:office" xmlns:oel="http://schemas.microsoft.com/office/2019/extlst" xmlns:r="http://schemas.openxmlformats.org/officeDocument/2006/relationships" xmlns:m="http://schemas.openxmlformats.org/officeDocument/2006/math" xmlns:v="urn:schemas-microsoft-com:vml" xmlns:wp14="http://schemas.microsoft.com/office/word/2010/wordprocessingDrawing" xmlns:wp="http://schemas.openxmlformats.org/drawingml/2006/wordprocessingDrawing" xmlns:w10="urn:schemas-microsoft-com:office:word" xmlns:w="http://schemas.openxmlformats.org/wordprocessingml/2006/main" xmlns:w14="http://schemas.microsoft.com/office/word/2010/wordml" xmlns:w15="http://schemas.microsoft.com/office/word/2012/wordml" xmlns:w16cex="http://schemas.microsoft.com/office/word/2018/wordml/cex" xmlns:w16cid="http://schemas.microsoft.com/office/word/2016/wordml/cid" xmlns:w16="http://schemas.microsoft.com/office/word/2018/wordml" xmlns:w16du="http://schemas.microsoft.com/office/word/2023/wordml/word16du" xmlns:w16sdtdh="http://schemas.microsoft.com/office/word/2020/wordml/sdtdatahash" xmlns:w16se="http://schemas.microsoft.com/office/word/2015/wordml/symex" xmlns:wpg="http://schemas.microsoft.com/office/word/2010/wordprocessingGroup" xmlns:wpi="http://schemas.microsoft.com/office/word/2010/wordprocessingInk" xmlns:wne="http://schemas.microsoft.com/office/word/2006/wordml" xmlns:wps="http://schemas.microsoft.com/office/word/2010/wordprocessingShape" mc:Ignorable="w14 w15 w16se w16cid w16 w16cex w16sdtdh w16du wp14">
   <w:footnote w:type="separator" w:id="-1">
     <w:p>
       <w:r>
@@ -1311,7 +1442,7 @@
 </file>
 
 <file path=word/header1.xml><?xml version="1.0" encoding="utf-8"?>
-<w:hdr xmlns:wpc="http://schemas.microsoft.com/office/word/2010/wordprocessingCanvas" xmlns:cx="http://schemas.microsoft.com/office/drawing/2014/chartex" xmlns:cx1="http://schemas.microsoft.com/office/drawing/2015/9/8/chartex" xmlns:cx2="http://schemas.microsoft.com/office/drawing/2015/10/21/chartex" xmlns:cx3="http://schemas.microsoft.com/office/drawing/2016/5/9/chartex" xmlns:cx4="http://schemas.microsoft.com/office/drawing/2016/5/10/chartex" xmlns:cx5="http://schemas.microsoft.com/office/drawing/2016/5/11/chartex" xmlns:cx6="http://schemas.microsoft.com/office/drawing/2016/5/12/chartex" xmlns:cx7="http://schemas.microsoft.com/office/drawing/2016/5/13/chartex" xmlns:cx8="http://schemas.microsoft.com/office/drawing/2016/5/14/chartex" xmlns:mc="http://schemas.openxmlformats.org/markup-compatibility/2006" xmlns:aink="http://schemas.microsoft.com/office/drawing/2016/ink" xmlns:am3d="http://schemas.microsoft.com/office/drawing/2017/model3d" xmlns:o="urn:schemas-microsoft-com:office:office" xmlns:oel="http://schemas.microsoft.com/office/2019/extlst" xmlns:r="http://schemas.openxmlformats.org/officeDocument/2006/relationships" xmlns:m="http://schemas.openxmlformats.org/officeDocument/2006/math" xmlns:v="urn:schemas-microsoft-com:vml" xmlns:wp14="http://schemas.microsoft.com/office/word/2010/wordprocessingDrawing" xmlns:wp="http://schemas.openxmlformats.org/drawingml/2006/wordprocessingDrawing" xmlns:w10="urn:schemas-microsoft-com:office:word" xmlns:w="http://schemas.openxmlformats.org/wordprocessingml/2006/main" xmlns:w14="http://schemas.microsoft.com/office/word/2010/wordml" xmlns:w15="http://schemas.microsoft.com/office/word/2012/wordml" xmlns:w16cex="http://schemas.microsoft.com/office/word/2018/wordml/cex" xmlns:w16cid="http://schemas.microsoft.com/office/word/2016/wordml/cid" xmlns:w16="http://schemas.microsoft.com/office/word/2018/wordml" xmlns:w16sdtdh="http://schemas.microsoft.com/office/word/2020/wordml/sdtdatahash" xmlns:w16se="http://schemas.microsoft.com/office/word/2015/wordml/symex" xmlns:wpg="http://schemas.microsoft.com/office/word/2010/wordprocessingGroup" xmlns:wpi="http://schemas.microsoft.com/office/word/2010/wordprocessingInk" xmlns:wne="http://schemas.microsoft.com/office/word/2006/wordml" xmlns:wps="http://schemas.microsoft.com/office/word/2010/wordprocessingShape" mc:Ignorable="w14 w15 w16se w16cid w16 w16cex w16sdtdh wp14">
+<w:hdr xmlns:wpc="http://schemas.microsoft.com/office/word/2010/wordprocessingCanvas" xmlns:cx="http://schemas.microsoft.com/office/drawing/2014/chartex" xmlns:cx1="http://schemas.microsoft.com/office/drawing/2015/9/8/chartex" xmlns:cx2="http://schemas.microsoft.com/office/drawing/2015/10/21/chartex" xmlns:cx3="http://schemas.microsoft.com/office/drawing/2016/5/9/chartex" xmlns:cx4="http://schemas.microsoft.com/office/drawing/2016/5/10/chartex" xmlns:cx5="http://schemas.microsoft.com/office/drawing/2016/5/11/chartex" xmlns:cx6="http://schemas.microsoft.com/office/drawing/2016/5/12/chartex" xmlns:cx7="http://schemas.microsoft.com/office/drawing/2016/5/13/chartex" xmlns:cx8="http://schemas.microsoft.com/office/drawing/2016/5/14/chartex" xmlns:mc="http://schemas.openxmlformats.org/markup-compatibility/2006" xmlns:aink="http://schemas.microsoft.com/office/drawing/2016/ink" xmlns:am3d="http://schemas.microsoft.com/office/drawing/2017/model3d" xmlns:o="urn:schemas-microsoft-com:office:office" xmlns:oel="http://schemas.microsoft.com/office/2019/extlst" xmlns:r="http://schemas.openxmlformats.org/officeDocument/2006/relationships" xmlns:m="http://schemas.openxmlformats.org/officeDocument/2006/math" xmlns:v="urn:schemas-microsoft-com:vml" xmlns:wp14="http://schemas.microsoft.com/office/word/2010/wordprocessingDrawing" xmlns:wp="http://schemas.openxmlformats.org/drawingml/2006/wordprocessingDrawing" xmlns:w10="urn:schemas-microsoft-com:office:word" xmlns:w="http://schemas.openxmlformats.org/wordprocessingml/2006/main" xmlns:w14="http://schemas.microsoft.com/office/word/2010/wordml" xmlns:w15="http://schemas.microsoft.com/office/word/2012/wordml" xmlns:w16cex="http://schemas.microsoft.com/office/word/2018/wordml/cex" xmlns:w16cid="http://schemas.microsoft.com/office/word/2016/wordml/cid" xmlns:w16="http://schemas.microsoft.com/office/word/2018/wordml" xmlns:w16du="http://schemas.microsoft.com/office/word/2023/wordml/word16du" xmlns:w16sdtdh="http://schemas.microsoft.com/office/word/2020/wordml/sdtdatahash" xmlns:w16se="http://schemas.microsoft.com/office/word/2015/wordml/symex" xmlns:wpg="http://schemas.microsoft.com/office/word/2010/wordprocessingGroup" xmlns:wpi="http://schemas.microsoft.com/office/word/2010/wordprocessingInk" xmlns:wne="http://schemas.microsoft.com/office/word/2006/wordml" xmlns:wps="http://schemas.microsoft.com/office/word/2010/wordprocessingShape" mc:Ignorable="w14 w15 w16se w16cid w16 w16cex w16sdtdh w16du wp14">
   <w:p>
     <w:pPr>
       <w:pStyle w:val="Header"/>
@@ -1321,7 +1452,7 @@
         <w:noProof/>
       </w:rPr>
       <w:drawing>
-        <wp:anchor distT="0" distB="0" distL="114300" distR="114300" simplePos="0" relativeHeight="251682816" behindDoc="1" locked="0" layoutInCell="1" allowOverlap="1" wp14:anchorId="44380531" wp14:editId="342BFF6B">
+        <wp:anchor distT="0" distB="0" distL="114300" distR="114300" simplePos="0" relativeHeight="251682816" behindDoc="1" locked="0" layoutInCell="1" allowOverlap="1" wp14:anchorId="035AB358" wp14:editId="499EF935">
           <wp:simplePos x="0" y="0"/>
           <wp:positionH relativeFrom="page">
             <wp:align>right</wp:align>
@@ -1329,7 +1460,7 @@
           <wp:positionV relativeFrom="paragraph">
             <wp:posOffset>-894080</wp:posOffset>
           </wp:positionV>
-          <wp:extent cx="7544991" cy="10677114"/>
+          <wp:extent cx="7544991" cy="10672215"/>
           <wp:effectExtent l="0" t="0" r="0" b="0"/>
           <wp:wrapNone/>
           <wp:docPr id="1500699916" name="Picture 1500699916">
@@ -1346,7 +1477,7 @@
             <a:graphicData uri="http://schemas.openxmlformats.org/drawingml/2006/picture">
               <pic:pic xmlns:pic="http://schemas.openxmlformats.org/drawingml/2006/picture">
                 <pic:nvPicPr>
-                  <pic:cNvPr id="4" name="Picture 4">
+                  <pic:cNvPr id="1500699916" name="Picture 1500699916">
                     <a:extLst>
                       <a:ext uri="{C183D7F6-B498-43B3-948B-1728B52AA6E4}">
                         <adec:decorative xmlns:adec="http://schemas.microsoft.com/office/drawing/2017/decorative" val="1"/>
@@ -1370,7 +1501,7 @@
                 <pic:spPr>
                   <a:xfrm>
                     <a:off x="0" y="0"/>
-                    <a:ext cx="7544991" cy="10677114"/>
+                    <a:ext cx="7544991" cy="10672215"/>
                   </a:xfrm>
                   <a:prstGeom prst="rect">
                     <a:avLst/>
@@ -1396,7 +1527,7 @@
 </file>
 
 <file path=word/numbering.xml><?xml version="1.0" encoding="utf-8"?>
-<w:numbering xmlns:wpc="http://schemas.microsoft.com/office/word/2010/wordprocessingCanvas" xmlns:cx="http://schemas.microsoft.com/office/drawing/2014/chartex" xmlns:cx1="http://schemas.microsoft.com/office/drawing/2015/9/8/chartex" xmlns:cx2="http://schemas.microsoft.com/office/drawing/2015/10/21/chartex" xmlns:cx3="http://schemas.microsoft.com/office/drawing/2016/5/9/chartex" xmlns:cx4="http://schemas.microsoft.com/office/drawing/2016/5/10/chartex" xmlns:cx5="http://schemas.microsoft.com/office/drawing/2016/5/11/chartex" xmlns:cx6="http://schemas.microsoft.com/office/drawing/2016/5/12/chartex" xmlns:cx7="http://schemas.microsoft.com/office/drawing/2016/5/13/chartex" xmlns:cx8="http://schemas.microsoft.com/office/drawing/2016/5/14/chartex" xmlns:mc="http://schemas.openxmlformats.org/markup-compatibility/2006" xmlns:aink="http://schemas.microsoft.com/office/drawing/2016/ink" xmlns:am3d="http://schemas.microsoft.com/office/drawing/2017/model3d" xmlns:o="urn:schemas-microsoft-com:office:office" xmlns:oel="http://schemas.microsoft.com/office/2019/extlst" xmlns:r="http://schemas.openxmlformats.org/officeDocument/2006/relationships" xmlns:m="http://schemas.openxmlformats.org/officeDocument/2006/math" xmlns:v="urn:schemas-microsoft-com:vml" xmlns:wp14="http://schemas.microsoft.com/office/word/2010/wordprocessingDrawing" xmlns:wp="http://schemas.openxmlformats.org/drawingml/2006/wordprocessingDrawing" xmlns:w10="urn:schemas-microsoft-com:office:word" xmlns:w="http://schemas.openxmlformats.org/wordprocessingml/2006/main" xmlns:w14="http://schemas.microsoft.com/office/word/2010/wordml" xmlns:w15="http://schemas.microsoft.com/office/word/2012/wordml" xmlns:w16cex="http://schemas.microsoft.com/office/word/2018/wordml/cex" xmlns:w16cid="http://schemas.microsoft.com/office/word/2016/wordml/cid" xmlns:w16="http://schemas.microsoft.com/office/word/2018/wordml" xmlns:w16sdtdh="http://schemas.microsoft.com/office/word/2020/wordml/sdtdatahash" xmlns:w16se="http://schemas.microsoft.com/office/word/2015/wordml/symex" xmlns:wpg="http://schemas.microsoft.com/office/word/2010/wordprocessingGroup" xmlns:wpi="http://schemas.microsoft.com/office/word/2010/wordprocessingInk" xmlns:wne="http://schemas.microsoft.com/office/word/2006/wordml" xmlns:wps="http://schemas.microsoft.com/office/word/2010/wordprocessingShape" mc:Ignorable="w14 w15 w16se w16cid w16 w16cex w16sdtdh wp14">
+<w:numbering xmlns:wpc="http://schemas.microsoft.com/office/word/2010/wordprocessingCanvas" xmlns:cx="http://schemas.microsoft.com/office/drawing/2014/chartex" xmlns:cx1="http://schemas.microsoft.com/office/drawing/2015/9/8/chartex" xmlns:cx2="http://schemas.microsoft.com/office/drawing/2015/10/21/chartex" xmlns:cx3="http://schemas.microsoft.com/office/drawing/2016/5/9/chartex" xmlns:cx4="http://schemas.microsoft.com/office/drawing/2016/5/10/chartex" xmlns:cx5="http://schemas.microsoft.com/office/drawing/2016/5/11/chartex" xmlns:cx6="http://schemas.microsoft.com/office/drawing/2016/5/12/chartex" xmlns:cx7="http://schemas.microsoft.com/office/drawing/2016/5/13/chartex" xmlns:cx8="http://schemas.microsoft.com/office/drawing/2016/5/14/chartex" xmlns:mc="http://schemas.openxmlformats.org/markup-compatibility/2006" xmlns:aink="http://schemas.microsoft.com/office/drawing/2016/ink" xmlns:am3d="http://schemas.microsoft.com/office/drawing/2017/model3d" xmlns:o="urn:schemas-microsoft-com:office:office" xmlns:oel="http://schemas.microsoft.com/office/2019/extlst" xmlns:r="http://schemas.openxmlformats.org/officeDocument/2006/relationships" xmlns:m="http://schemas.openxmlformats.org/officeDocument/2006/math" xmlns:v="urn:schemas-microsoft-com:vml" xmlns:wp14="http://schemas.microsoft.com/office/word/2010/wordprocessingDrawing" xmlns:wp="http://schemas.openxmlformats.org/drawingml/2006/wordprocessingDrawing" xmlns:w10="urn:schemas-microsoft-com:office:word" xmlns:w="http://schemas.openxmlformats.org/wordprocessingml/2006/main" xmlns:w14="http://schemas.microsoft.com/office/word/2010/wordml" xmlns:w15="http://schemas.microsoft.com/office/word/2012/wordml" xmlns:w16cex="http://schemas.microsoft.com/office/word/2018/wordml/cex" xmlns:w16cid="http://schemas.microsoft.com/office/word/2016/wordml/cid" xmlns:w16="http://schemas.microsoft.com/office/word/2018/wordml" xmlns:w16du="http://schemas.microsoft.com/office/word/2023/wordml/word16du" xmlns:w16sdtdh="http://schemas.microsoft.com/office/word/2020/wordml/sdtdatahash" xmlns:w16se="http://schemas.microsoft.com/office/word/2015/wordml/symex" xmlns:wpg="http://schemas.microsoft.com/office/word/2010/wordprocessingGroup" xmlns:wpi="http://schemas.microsoft.com/office/word/2010/wordprocessingInk" xmlns:wne="http://schemas.microsoft.com/office/word/2006/wordml" xmlns:wps="http://schemas.microsoft.com/office/word/2010/wordprocessingShape" mc:Ignorable="w14 w15 w16se w16cid w16 w16cex w16sdtdh w16du wp14">
   <w:abstractNum w:abstractNumId="0" w15:restartNumberingAfterBreak="0">
     <w:nsid w:val="014153BA"/>
     <w:multiLevelType w:val="multilevel"/>
@@ -3459,7 +3590,7 @@
 </file>
 
 <file path=word/styles.xml><?xml version="1.0" encoding="utf-8"?>
-<w:styles xmlns:mc="http://schemas.openxmlformats.org/markup-compatibility/2006" xmlns:r="http://schemas.openxmlformats.org/officeDocument/2006/relationships" xmlns:w="http://schemas.openxmlformats.org/wordprocessingml/2006/main" xmlns:w14="http://schemas.microsoft.com/office/word/2010/wordml" xmlns:w15="http://schemas.microsoft.com/office/word/2012/wordml" xmlns:w16cex="http://schemas.microsoft.com/office/word/2018/wordml/cex" xmlns:w16cid="http://schemas.microsoft.com/office/word/2016/wordml/cid" xmlns:w16="http://schemas.microsoft.com/office/word/2018/wordml" xmlns:w16sdtdh="http://schemas.microsoft.com/office/word/2020/wordml/sdtdatahash" xmlns:w16se="http://schemas.microsoft.com/office/word/2015/wordml/symex" mc:Ignorable="w14 w15 w16se w16cid w16 w16cex w16sdtdh">
+<w:styles xmlns:mc="http://schemas.openxmlformats.org/markup-compatibility/2006" xmlns:r="http://schemas.openxmlformats.org/officeDocument/2006/relationships" xmlns:w="http://schemas.openxmlformats.org/wordprocessingml/2006/main" xmlns:w14="http://schemas.microsoft.com/office/word/2010/wordml" xmlns:w15="http://schemas.microsoft.com/office/word/2012/wordml" xmlns:w16cex="http://schemas.microsoft.com/office/word/2018/wordml/cex" xmlns:w16cid="http://schemas.microsoft.com/office/word/2016/wordml/cid" xmlns:w16="http://schemas.microsoft.com/office/word/2018/wordml" xmlns:w16du="http://schemas.microsoft.com/office/word/2023/wordml/word16du" xmlns:w16sdtdh="http://schemas.microsoft.com/office/word/2020/wordml/sdtdatahash" xmlns:w16se="http://schemas.microsoft.com/office/word/2015/wordml/symex" mc:Ignorable="w14 w15 w16se w16cid w16 w16cex w16sdtdh w16du">
   <w:docDefaults>
     <w:rPrDefault>
       <w:rPr>
@@ -3856,7 +3987,7 @@
   <w:style w:type="paragraph" w:default="1" w:styleId="Normal">
     <w:name w:val="Normal"/>
     <w:qFormat/>
-    <w:rsid w:val="00620705"/>
+    <w:rsid w:val="005A0BDA"/>
     <w:rPr>
       <w:rFonts w:ascii="Arial" w:hAnsi="Arial"/>
       <w:sz w:val="24"/>
@@ -5710,44 +5841,612 @@
       <w:ind w:left="1920"/>
     </w:pPr>
   </w:style>
-  <w:style w:type="paragraph" w:styleId="Title">
-    <w:name w:val="Title"/>
-    <w:basedOn w:val="Normal"/>
-    <w:next w:val="Normal"/>
-    <w:link w:val="TitleChar"/>
-    <w:uiPriority w:val="10"/>
+  <w:style w:type="character" w:styleId="Strong">
+    <w:name w:val="Strong"/>
+    <w:basedOn w:val="DefaultParagraphFont"/>
+    <w:uiPriority w:val="22"/>
     <w:semiHidden/>
     <w:qFormat/>
     <w:locked/>
-    <w:rsid w:val="009E1F75"/>
-    <w:pPr>
-      <w:spacing w:after="0" w:line="240" w:lineRule="auto"/>
-      <w:contextualSpacing/>
-    </w:pPr>
-    <w:rPr>
-      <w:rFonts w:asciiTheme="majorHAnsi" w:eastAsiaTheme="majorEastAsia" w:hAnsiTheme="majorHAnsi" w:cstheme="majorBidi"/>
-      <w:spacing w:val="-10"/>
-      <w:kern w:val="28"/>
-      <w:sz w:val="56"/>
-      <w:szCs w:val="56"/>
-    </w:rPr>
-  </w:style>
-  <w:style w:type="character" w:customStyle="1" w:styleId="TitleChar">
-    <w:name w:val="Title Char"/>
+    <w:rsid w:val="00692202"/>
+    <w:rPr>
+      <w:b/>
+      <w:bCs/>
+    </w:rPr>
+  </w:style>
+</w:styles>
+</file>
+
+<file path=word/glossary/document.xml><?xml version="1.0" encoding="utf-8"?>
+<w:glossaryDocument xmlns:wpc="http://schemas.microsoft.com/office/word/2010/wordprocessingCanvas" xmlns:cx="http://schemas.microsoft.com/office/drawing/2014/chartex" xmlns:cx1="http://schemas.microsoft.com/office/drawing/2015/9/8/chartex" xmlns:cx2="http://schemas.microsoft.com/office/drawing/2015/10/21/chartex" xmlns:cx3="http://schemas.microsoft.com/office/drawing/2016/5/9/chartex" xmlns:cx4="http://schemas.microsoft.com/office/drawing/2016/5/10/chartex" xmlns:cx5="http://schemas.microsoft.com/office/drawing/2016/5/11/chartex" xmlns:cx6="http://schemas.microsoft.com/office/drawing/2016/5/12/chartex" xmlns:cx7="http://schemas.microsoft.com/office/drawing/2016/5/13/chartex" xmlns:cx8="http://schemas.microsoft.com/office/drawing/2016/5/14/chartex" xmlns:mc="http://schemas.openxmlformats.org/markup-compatibility/2006" xmlns:aink="http://schemas.microsoft.com/office/drawing/2016/ink" xmlns:am3d="http://schemas.microsoft.com/office/drawing/2017/model3d" xmlns:o="urn:schemas-microsoft-com:office:office" xmlns:oel="http://schemas.microsoft.com/office/2019/extlst" xmlns:r="http://schemas.openxmlformats.org/officeDocument/2006/relationships" xmlns:m="http://schemas.openxmlformats.org/officeDocument/2006/math" xmlns:v="urn:schemas-microsoft-com:vml" xmlns:wp14="http://schemas.microsoft.com/office/word/2010/wordprocessingDrawing" xmlns:wp="http://schemas.openxmlformats.org/drawingml/2006/wordprocessingDrawing" xmlns:w10="urn:schemas-microsoft-com:office:word" xmlns:w="http://schemas.openxmlformats.org/wordprocessingml/2006/main" xmlns:w14="http://schemas.microsoft.com/office/word/2010/wordml" xmlns:w15="http://schemas.microsoft.com/office/word/2012/wordml" xmlns:w16cex="http://schemas.microsoft.com/office/word/2018/wordml/cex" xmlns:w16cid="http://schemas.microsoft.com/office/word/2016/wordml/cid" xmlns:w16="http://schemas.microsoft.com/office/word/2018/wordml" xmlns:w16du="http://schemas.microsoft.com/office/word/2023/wordml/word16du" xmlns:w16sdtdh="http://schemas.microsoft.com/office/word/2020/wordml/sdtdatahash" xmlns:w16se="http://schemas.microsoft.com/office/word/2015/wordml/symex" xmlns:wpg="http://schemas.microsoft.com/office/word/2010/wordprocessingGroup" xmlns:wpi="http://schemas.microsoft.com/office/word/2010/wordprocessingInk" xmlns:wne="http://schemas.microsoft.com/office/word/2006/wordml" xmlns:wps="http://schemas.microsoft.com/office/word/2010/wordprocessingShape" mc:Ignorable="w14 w15 w16se w16cid w16 w16cex w16sdtdh w16du wp14">
+  <w:docParts>
+    <w:docPart>
+      <w:docPartPr>
+        <w:name w:val="7D12028B95D1447F9D38610B8038AAD5"/>
+        <w:category>
+          <w:name w:val="General"/>
+          <w:gallery w:val="placeholder"/>
+        </w:category>
+        <w:types>
+          <w:type w:val="bbPlcHdr"/>
+        </w:types>
+        <w:behaviors>
+          <w:behavior w:val="content"/>
+        </w:behaviors>
+        <w:guid w:val="{5F8AD025-EA55-420B-8543-821F7A45AE0B}"/>
+      </w:docPartPr>
+      <w:docPartBody>
+        <w:p>
+          <w:pPr>
+            <w:pStyle w:val="7D12028B95D1447F9D38610B8038AAD5"/>
+          </w:pPr>
+          <w:r>
+            <w:rPr>
+              <w:rStyle w:val="PlaceholderText"/>
+            </w:rPr>
+            <w:t>[Title]</w:t>
+          </w:r>
+        </w:p>
+      </w:docPartBody>
+    </w:docPart>
+  </w:docParts>
+</w:glossaryDocument>
+</file>
+
+<file path=word/glossary/fontTable.xml><?xml version="1.0" encoding="utf-8"?>
+<w:fonts xmlns:mc="http://schemas.openxmlformats.org/markup-compatibility/2006" xmlns:r="http://schemas.openxmlformats.org/officeDocument/2006/relationships" xmlns:w="http://schemas.openxmlformats.org/wordprocessingml/2006/main" xmlns:w14="http://schemas.microsoft.com/office/word/2010/wordml" xmlns:w15="http://schemas.microsoft.com/office/word/2012/wordml" xmlns:w16cex="http://schemas.microsoft.com/office/word/2018/wordml/cex" xmlns:w16cid="http://schemas.microsoft.com/office/word/2016/wordml/cid" xmlns:w16="http://schemas.microsoft.com/office/word/2018/wordml" xmlns:w16du="http://schemas.microsoft.com/office/word/2023/wordml/word16du" xmlns:w16sdtdh="http://schemas.microsoft.com/office/word/2020/wordml/sdtdatahash" xmlns:w16se="http://schemas.microsoft.com/office/word/2015/wordml/symex" mc:Ignorable="w14 w15 w16se w16cid w16 w16cex w16sdtdh w16du">
+  <w:font w:name="Times New Roman">
+    <w:panose1 w:val="02020603050405020304"/>
+    <w:charset w:val="00"/>
+    <w:family w:val="roman"/>
+    <w:pitch w:val="variable"/>
+    <w:sig w:usb0="E0002EFF" w:usb1="C000785B" w:usb2="00000009" w:usb3="00000000" w:csb0="000001FF" w:csb1="00000000"/>
+  </w:font>
+  <w:font w:name="Symbol">
+    <w:panose1 w:val="05050102010706020507"/>
+    <w:charset w:val="02"/>
+    <w:family w:val="roman"/>
+    <w:pitch w:val="variable"/>
+    <w:sig w:usb0="00000000" w:usb1="10000000" w:usb2="00000000" w:usb3="00000000" w:csb0="80000000" w:csb1="00000000"/>
+  </w:font>
+  <w:font w:name="Courier New">
+    <w:panose1 w:val="02070309020205020404"/>
+    <w:charset w:val="00"/>
+    <w:family w:val="modern"/>
+    <w:pitch w:val="fixed"/>
+    <w:sig w:usb0="E0002EFF" w:usb1="C0007843" w:usb2="00000009" w:usb3="00000000" w:csb0="000001FF" w:csb1="00000000"/>
+  </w:font>
+  <w:font w:name="Wingdings">
+    <w:panose1 w:val="05000000000000000000"/>
+    <w:charset w:val="02"/>
+    <w:family w:val="auto"/>
+    <w:pitch w:val="variable"/>
+    <w:sig w:usb0="00000000" w:usb1="10000000" w:usb2="00000000" w:usb3="00000000" w:csb0="80000000" w:csb1="00000000"/>
+  </w:font>
+  <w:font w:name="Arial">
+    <w:panose1 w:val="020B0604020202020204"/>
+    <w:charset w:val="00"/>
+    <w:family w:val="swiss"/>
+    <w:pitch w:val="variable"/>
+    <w:sig w:usb0="E0002EFF" w:usb1="C000785B" w:usb2="00000009" w:usb3="00000000" w:csb0="000001FF" w:csb1="00000000"/>
+  </w:font>
+  <w:font w:name="Segoe UI">
+    <w:panose1 w:val="020B0502040204020203"/>
+    <w:charset w:val="00"/>
+    <w:family w:val="swiss"/>
+    <w:pitch w:val="variable"/>
+    <w:sig w:usb0="E4002EFF" w:usb1="C000E47F" w:usb2="00000009" w:usb3="00000000" w:csb0="000001FF" w:csb1="00000000"/>
+  </w:font>
+  <w:font w:name="Calibri">
+    <w:panose1 w:val="020F0502020204030204"/>
+    <w:charset w:val="00"/>
+    <w:family w:val="swiss"/>
+    <w:pitch w:val="variable"/>
+    <w:sig w:usb0="E4002EFF" w:usb1="C000247B" w:usb2="00000009" w:usb3="00000000" w:csb0="000001FF" w:csb1="00000000"/>
+  </w:font>
+  <w:font w:name="Aptos">
+    <w:charset w:val="00"/>
+    <w:family w:val="swiss"/>
+    <w:pitch w:val="variable"/>
+    <w:sig w:usb0="20000287" w:usb1="00000003" w:usb2="00000000" w:usb3="00000000" w:csb0="0000019F" w:csb1="00000000"/>
+  </w:font>
+  <w:font w:name="Aptos Display">
+    <w:charset w:val="00"/>
+    <w:family w:val="swiss"/>
+    <w:pitch w:val="variable"/>
+    <w:sig w:usb0="20000287" w:usb1="00000003" w:usb2="00000000" w:usb3="00000000" w:csb0="0000019F" w:csb1="00000000"/>
+  </w:font>
+</w:fonts>
+</file>
+
+<file path=word/glossary/settings.xml><?xml version="1.0" encoding="utf-8"?>
+<w:settings xmlns:mc="http://schemas.openxmlformats.org/markup-compatibility/2006" xmlns:o="urn:schemas-microsoft-com:office:office" xmlns:r="http://schemas.openxmlformats.org/officeDocument/2006/relationships" xmlns:m="http://schemas.openxmlformats.org/officeDocument/2006/math" xmlns:v="urn:schemas-microsoft-com:vml" xmlns:w10="urn:schemas-microsoft-com:office:word" xmlns:w="http://schemas.openxmlformats.org/wordprocessingml/2006/main" xmlns:w14="http://schemas.microsoft.com/office/word/2010/wordml" xmlns:w15="http://schemas.microsoft.com/office/word/2012/wordml" xmlns:w16cex="http://schemas.microsoft.com/office/word/2018/wordml/cex" xmlns:w16cid="http://schemas.microsoft.com/office/word/2016/wordml/cid" xmlns:w16="http://schemas.microsoft.com/office/word/2018/wordml" xmlns:w16du="http://schemas.microsoft.com/office/word/2023/wordml/word16du" xmlns:w16sdtdh="http://schemas.microsoft.com/office/word/2020/wordml/sdtdatahash" xmlns:w16se="http://schemas.microsoft.com/office/word/2015/wordml/symex" xmlns:sl="http://schemas.openxmlformats.org/schemaLibrary/2006/main" mc:Ignorable="w14 w15 w16se w16cid w16 w16cex w16sdtdh w16du">
+  <w:view w:val="normal"/>
+  <w:defaultTabStop w:val="720"/>
+  <w:characterSpacingControl w:val="doNotCompress"/>
+  <w:compat>
+    <w:useFELayout/>
+    <w:compatSetting w:name="compatibilityMode" w:uri="http://schemas.microsoft.com/office/word" w:val="15"/>
+    <w:compatSetting w:name="overrideTableStyleFontSizeAndJustification" w:uri="http://schemas.microsoft.com/office/word" w:val="1"/>
+    <w:compatSetting w:name="enableOpenTypeFeatures" w:uri="http://schemas.microsoft.com/office/word" w:val="1"/>
+    <w:compatSetting w:name="doNotFlipMirrorIndents" w:uri="http://schemas.microsoft.com/office/word" w:val="1"/>
+    <w:compatSetting w:name="differentiateMultirowTableHeaders" w:uri="http://schemas.microsoft.com/office/word" w:val="1"/>
+    <w:compatSetting w:name="useWord2013TrackBottomHyphenation" w:uri="http://schemas.microsoft.com/office/word" w:val="0"/>
+  </w:compat>
+  <w:rsids>
+    <w:rsidRoot w:val="0033444B"/>
+    <w:rsid w:val="0033444B"/>
+    <w:rsid w:val="00DF09DF"/>
+  </w:rsids>
+  <m:mathPr>
+    <m:mathFont m:val="Cambria Math"/>
+    <m:brkBin m:val="before"/>
+    <m:brkBinSub m:val="--"/>
+    <m:smallFrac m:val="0"/>
+    <m:dispDef/>
+    <m:lMargin m:val="0"/>
+    <m:rMargin m:val="0"/>
+    <m:defJc m:val="centerGroup"/>
+    <m:wrapIndent m:val="1440"/>
+    <m:intLim m:val="subSup"/>
+    <m:naryLim m:val="undOvr"/>
+  </m:mathPr>
+  <w:themeFontLang w:val="en-GB"/>
+  <w:clrSchemeMapping w:bg1="light1" w:t1="dark1" w:bg2="light2" w:t2="dark2" w:accent1="accent1" w:accent2="accent2" w:accent3="accent3" w:accent4="accent4" w:accent5="accent5" w:accent6="accent6" w:hyperlink="hyperlink" w:followedHyperlink="followedHyperlink"/>
+  <w:decimalSymbol w:val="."/>
+  <w:listSeparator w:val=","/>
+  <w15:chartTrackingRefBased/>
+</w:settings>
+</file>
+
+<file path=word/glossary/styles.xml><?xml version="1.0" encoding="utf-8"?>
+<w:styles xmlns:mc="http://schemas.openxmlformats.org/markup-compatibility/2006" xmlns:r="http://schemas.openxmlformats.org/officeDocument/2006/relationships" xmlns:w="http://schemas.openxmlformats.org/wordprocessingml/2006/main" xmlns:w14="http://schemas.microsoft.com/office/word/2010/wordml" xmlns:w15="http://schemas.microsoft.com/office/word/2012/wordml" xmlns:w16cex="http://schemas.microsoft.com/office/word/2018/wordml/cex" xmlns:w16cid="http://schemas.microsoft.com/office/word/2016/wordml/cid" xmlns:w16="http://schemas.microsoft.com/office/word/2018/wordml" xmlns:w16du="http://schemas.microsoft.com/office/word/2023/wordml/word16du" xmlns:w16sdtdh="http://schemas.microsoft.com/office/word/2020/wordml/sdtdatahash" xmlns:w16se="http://schemas.microsoft.com/office/word/2015/wordml/symex" mc:Ignorable="w14 w15 w16se w16cid w16 w16cex w16sdtdh w16du">
+  <w:docDefaults>
+    <w:rPrDefault>
+      <w:rPr>
+        <w:rFonts w:asciiTheme="minorHAnsi" w:eastAsiaTheme="minorEastAsia" w:hAnsiTheme="minorHAnsi" w:cstheme="minorBidi"/>
+        <w:kern w:val="2"/>
+        <w:sz w:val="24"/>
+        <w:szCs w:val="24"/>
+        <w:lang w:val="en-GB" w:eastAsia="en-GB" w:bidi="ar-SA"/>
+        <w14:ligatures w14:val="standardContextual"/>
+      </w:rPr>
+    </w:rPrDefault>
+    <w:pPrDefault>
+      <w:pPr>
+        <w:spacing w:after="160" w:line="278" w:lineRule="auto"/>
+      </w:pPr>
+    </w:pPrDefault>
+  </w:docDefaults>
+  <w:latentStyles w:defLockedState="0" w:defUIPriority="99" w:defSemiHidden="0" w:defUnhideWhenUsed="0" w:defQFormat="0" w:count="376">
+    <w:lsdException w:name="Normal" w:uiPriority="0" w:qFormat="1"/>
+    <w:lsdException w:name="heading 1" w:uiPriority="9" w:qFormat="1"/>
+    <w:lsdException w:name="heading 2" w:semiHidden="1" w:uiPriority="9" w:unhideWhenUsed="1" w:qFormat="1"/>
+    <w:lsdException w:name="heading 3" w:semiHidden="1" w:uiPriority="9" w:unhideWhenUsed="1" w:qFormat="1"/>
+    <w:lsdException w:name="heading 4" w:semiHidden="1" w:uiPriority="9" w:unhideWhenUsed="1" w:qFormat="1"/>
+    <w:lsdException w:name="heading 5" w:semiHidden="1" w:uiPriority="9" w:unhideWhenUsed="1" w:qFormat="1"/>
+    <w:lsdException w:name="heading 6" w:semiHidden="1" w:uiPriority="9" w:unhideWhenUsed="1" w:qFormat="1"/>
+    <w:lsdException w:name="heading 7" w:semiHidden="1" w:uiPriority="9" w:unhideWhenUsed="1" w:qFormat="1"/>
+    <w:lsdException w:name="heading 8" w:semiHidden="1" w:uiPriority="9" w:unhideWhenUsed="1" w:qFormat="1"/>
+    <w:lsdException w:name="heading 9" w:semiHidden="1" w:uiPriority="9" w:unhideWhenUsed="1" w:qFormat="1"/>
+    <w:lsdException w:name="index 1" w:semiHidden="1" w:unhideWhenUsed="1"/>
+    <w:lsdException w:name="index 2" w:semiHidden="1" w:unhideWhenUsed="1"/>
+    <w:lsdException w:name="index 3" w:semiHidden="1" w:unhideWhenUsed="1"/>
+    <w:lsdException w:name="index 4" w:semiHidden="1" w:unhideWhenUsed="1"/>
+    <w:lsdException w:name="index 5" w:semiHidden="1" w:unhideWhenUsed="1"/>
+    <w:lsdException w:name="index 6" w:semiHidden="1" w:unhideWhenUsed="1"/>
+    <w:lsdException w:name="index 7" w:semiHidden="1" w:unhideWhenUsed="1"/>
+    <w:lsdException w:name="index 8" w:semiHidden="1" w:unhideWhenUsed="1"/>
+    <w:lsdException w:name="index 9" w:semiHidden="1" w:unhideWhenUsed="1"/>
+    <w:lsdException w:name="toc 1" w:semiHidden="1" w:uiPriority="39" w:unhideWhenUsed="1"/>
+    <w:lsdException w:name="toc 2" w:semiHidden="1" w:uiPriority="39" w:unhideWhenUsed="1"/>
+    <w:lsdException w:name="toc 3" w:semiHidden="1" w:uiPriority="39" w:unhideWhenUsed="1"/>
+    <w:lsdException w:name="toc 4" w:semiHidden="1" w:uiPriority="39" w:unhideWhenUsed="1"/>
+    <w:lsdException w:name="toc 5" w:semiHidden="1" w:uiPriority="39" w:unhideWhenUsed="1"/>
+    <w:lsdException w:name="toc 6" w:semiHidden="1" w:uiPriority="39" w:unhideWhenUsed="1"/>
+    <w:lsdException w:name="toc 7" w:semiHidden="1" w:uiPriority="39" w:unhideWhenUsed="1"/>
+    <w:lsdException w:name="toc 8" w:semiHidden="1" w:uiPriority="39" w:unhideWhenUsed="1"/>
+    <w:lsdException w:name="toc 9" w:semiHidden="1" w:uiPriority="39" w:unhideWhenUsed="1"/>
+    <w:lsdException w:name="Normal Indent" w:semiHidden="1" w:unhideWhenUsed="1"/>
+    <w:lsdException w:name="footnote text" w:semiHidden="1" w:unhideWhenUsed="1"/>
+    <w:lsdException w:name="annotation text" w:semiHidden="1" w:unhideWhenUsed="1"/>
+    <w:lsdException w:name="header" w:semiHidden="1" w:unhideWhenUsed="1"/>
+    <w:lsdException w:name="footer" w:semiHidden="1" w:unhideWhenUsed="1"/>
+    <w:lsdException w:name="index heading" w:semiHidden="1" w:unhideWhenUsed="1"/>
+    <w:lsdException w:name="caption" w:semiHidden="1" w:uiPriority="35" w:unhideWhenUsed="1" w:qFormat="1"/>
+    <w:lsdException w:name="table of figures" w:semiHidden="1" w:unhideWhenUsed="1"/>
+    <w:lsdException w:name="envelope address" w:semiHidden="1" w:unhideWhenUsed="1"/>
+    <w:lsdException w:name="envelope return" w:semiHidden="1" w:unhideWhenUsed="1"/>
+    <w:lsdException w:name="footnote reference" w:semiHidden="1" w:unhideWhenUsed="1"/>
+    <w:lsdException w:name="annotation reference" w:semiHidden="1" w:unhideWhenUsed="1"/>
+    <w:lsdException w:name="line number" w:semiHidden="1" w:unhideWhenUsed="1"/>
+    <w:lsdException w:name="page number" w:semiHidden="1" w:unhideWhenUsed="1"/>
+    <w:lsdException w:name="endnote reference" w:semiHidden="1" w:unhideWhenUsed="1"/>
+    <w:lsdException w:name="endnote text" w:semiHidden="1" w:unhideWhenUsed="1"/>
+    <w:lsdException w:name="table of authorities" w:semiHidden="1" w:unhideWhenUsed="1"/>
+    <w:lsdException w:name="macro" w:semiHidden="1" w:unhideWhenUsed="1"/>
+    <w:lsdException w:name="toa heading" w:semiHidden="1" w:unhideWhenUsed="1"/>
+    <w:lsdException w:name="List" w:semiHidden="1" w:unhideWhenUsed="1"/>
+    <w:lsdException w:name="List Bullet" w:semiHidden="1" w:unhideWhenUsed="1"/>
+    <w:lsdException w:name="List Number" w:semiHidden="1" w:unhideWhenUsed="1"/>
+    <w:lsdException w:name="List 2" w:semiHidden="1" w:unhideWhenUsed="1"/>
+    <w:lsdException w:name="List 3" w:semiHidden="1" w:unhideWhenUsed="1"/>
+    <w:lsdException w:name="List 4" w:semiHidden="1" w:unhideWhenUsed="1"/>
+    <w:lsdException w:name="List 5" w:semiHidden="1" w:unhideWhenUsed="1"/>
+    <w:lsdException w:name="List Bullet 2" w:semiHidden="1" w:unhideWhenUsed="1"/>
+    <w:lsdException w:name="List Bullet 3" w:semiHidden="1" w:unhideWhenUsed="1"/>
+    <w:lsdException w:name="List Bullet 4" w:semiHidden="1" w:unhideWhenUsed="1"/>
+    <w:lsdException w:name="List Bullet 5" w:semiHidden="1" w:unhideWhenUsed="1"/>
+    <w:lsdException w:name="List Number 2" w:semiHidden="1" w:unhideWhenUsed="1"/>
+    <w:lsdException w:name="List Number 3" w:semiHidden="1" w:unhideWhenUsed="1"/>
+    <w:lsdException w:name="List Number 4" w:semiHidden="1" w:unhideWhenUsed="1"/>
+    <w:lsdException w:name="List Number 5" w:semiHidden="1" w:unhideWhenUsed="1"/>
+    <w:lsdException w:name="Title" w:uiPriority="10" w:qFormat="1"/>
+    <w:lsdException w:name="Closing" w:semiHidden="1" w:unhideWhenUsed="1"/>
+    <w:lsdException w:name="Signature" w:semiHidden="1" w:unhideWhenUsed="1"/>
+    <w:lsdException w:name="Default Paragraph Font" w:semiHidden="1" w:uiPriority="1" w:unhideWhenUsed="1"/>
+    <w:lsdException w:name="Body Text" w:semiHidden="1" w:unhideWhenUsed="1"/>
+    <w:lsdException w:name="Body Text Indent" w:semiHidden="1" w:unhideWhenUsed="1"/>
+    <w:lsdException w:name="List Continue" w:semiHidden="1" w:unhideWhenUsed="1"/>
+    <w:lsdException w:name="List Continue 2" w:semiHidden="1" w:unhideWhenUsed="1"/>
+    <w:lsdException w:name="List Continue 3" w:semiHidden="1" w:unhideWhenUsed="1"/>
+    <w:lsdException w:name="List Continue 4" w:semiHidden="1" w:unhideWhenUsed="1"/>
+    <w:lsdException w:name="List Continue 5" w:semiHidden="1" w:unhideWhenUsed="1"/>
+    <w:lsdException w:name="Message Header" w:semiHidden="1" w:unhideWhenUsed="1"/>
+    <w:lsdException w:name="Subtitle" w:uiPriority="11" w:qFormat="1"/>
+    <w:lsdException w:name="Salutation" w:semiHidden="1" w:unhideWhenUsed="1"/>
+    <w:lsdException w:name="Date" w:semiHidden="1" w:unhideWhenUsed="1"/>
+    <w:lsdException w:name="Body Text First Indent" w:semiHidden="1" w:unhideWhenUsed="1"/>
+    <w:lsdException w:name="Body Text First Indent 2" w:semiHidden="1" w:unhideWhenUsed="1"/>
+    <w:lsdException w:name="Note Heading" w:semiHidden="1" w:unhideWhenUsed="1"/>
+    <w:lsdException w:name="Body Text 2" w:semiHidden="1" w:unhideWhenUsed="1"/>
+    <w:lsdException w:name="Body Text 3" w:semiHidden="1" w:unhideWhenUsed="1"/>
+    <w:lsdException w:name="Body Text Indent 2" w:semiHidden="1" w:unhideWhenUsed="1"/>
+    <w:lsdException w:name="Body Text Indent 3" w:semiHidden="1" w:unhideWhenUsed="1"/>
+    <w:lsdException w:name="Block Text" w:semiHidden="1" w:unhideWhenUsed="1"/>
+    <w:lsdException w:name="Hyperlink" w:semiHidden="1" w:unhideWhenUsed="1"/>
+    <w:lsdException w:name="FollowedHyperlink" w:semiHidden="1" w:unhideWhenUsed="1"/>
+    <w:lsdException w:name="Strong" w:uiPriority="22" w:qFormat="1"/>
+    <w:lsdException w:name="Emphasis" w:uiPriority="20" w:qFormat="1"/>
+    <w:lsdException w:name="Document Map" w:semiHidden="1" w:unhideWhenUsed="1"/>
+    <w:lsdException w:name="Plain Text" w:semiHidden="1" w:unhideWhenUsed="1"/>
+    <w:lsdException w:name="E-mail Signature" w:semiHidden="1" w:unhideWhenUsed="1"/>
+    <w:lsdException w:name="HTML Top of Form" w:semiHidden="1" w:unhideWhenUsed="1"/>
+    <w:lsdException w:name="HTML Bottom of Form" w:semiHidden="1" w:unhideWhenUsed="1"/>
+    <w:lsdException w:name="Normal (Web)" w:semiHidden="1" w:unhideWhenUsed="1"/>
+    <w:lsdException w:name="HTML Acronym" w:semiHidden="1" w:unhideWhenUsed="1"/>
+    <w:lsdException w:name="HTML Address" w:semiHidden="1" w:unhideWhenUsed="1"/>
+    <w:lsdException w:name="HTML Cite" w:semiHidden="1" w:unhideWhenUsed="1"/>
+    <w:lsdException w:name="HTML Code" w:semiHidden="1" w:unhideWhenUsed="1"/>
+    <w:lsdException w:name="HTML Definition" w:semiHidden="1" w:unhideWhenUsed="1"/>
+    <w:lsdException w:name="HTML Keyboard" w:semiHidden="1" w:unhideWhenUsed="1"/>
+    <w:lsdException w:name="HTML Preformatted" w:semiHidden="1" w:unhideWhenUsed="1"/>
+    <w:lsdException w:name="HTML Sample" w:semiHidden="1" w:unhideWhenUsed="1"/>
+    <w:lsdException w:name="HTML Typewriter" w:semiHidden="1" w:unhideWhenUsed="1"/>
+    <w:lsdException w:name="HTML Variable" w:semiHidden="1" w:unhideWhenUsed="1"/>
+    <w:lsdException w:name="Normal Table" w:semiHidden="1" w:unhideWhenUsed="1"/>
+    <w:lsdException w:name="annotation subject" w:semiHidden="1" w:unhideWhenUsed="1"/>
+    <w:lsdException w:name="No List" w:semiHidden="1" w:unhideWhenUsed="1"/>
+    <w:lsdException w:name="Outline List 1" w:semiHidden="1" w:unhideWhenUsed="1"/>
+    <w:lsdException w:name="Outline List 2" w:semiHidden="1" w:unhideWhenUsed="1"/>
+    <w:lsdException w:name="Outline List 3" w:semiHidden="1" w:unhideWhenUsed="1"/>
+    <w:lsdException w:name="Table Simple 1" w:semiHidden="1" w:unhideWhenUsed="1"/>
+    <w:lsdException w:name="Table Simple 2" w:semiHidden="1" w:unhideWhenUsed="1"/>
+    <w:lsdException w:name="Table Simple 3" w:semiHidden="1" w:unhideWhenUsed="1"/>
+    <w:lsdException w:name="Table Classic 1" w:semiHidden="1" w:unhideWhenUsed="1"/>
+    <w:lsdException w:name="Table Classic 2" w:semiHidden="1" w:unhideWhenUsed="1"/>
+    <w:lsdException w:name="Table Classic 3" w:semiHidden="1" w:unhideWhenUsed="1"/>
+    <w:lsdException w:name="Table Classic 4" w:semiHidden="1" w:unhideWhenUsed="1"/>
+    <w:lsdException w:name="Table Colorful 1" w:semiHidden="1" w:unhideWhenUsed="1"/>
+    <w:lsdException w:name="Table Colorful 2" w:semiHidden="1" w:unhideWhenUsed="1"/>
+    <w:lsdException w:name="Table Colorful 3" w:semiHidden="1" w:unhideWhenUsed="1"/>
+    <w:lsdException w:name="Table Columns 1" w:semiHidden="1" w:unhideWhenUsed="1"/>
+    <w:lsdException w:name="Table Columns 2" w:semiHidden="1" w:unhideWhenUsed="1"/>
+    <w:lsdException w:name="Table Columns 3" w:semiHidden="1" w:unhideWhenUsed="1"/>
+    <w:lsdException w:name="Table Columns 4" w:semiHidden="1" w:unhideWhenUsed="1"/>
+    <w:lsdException w:name="Table Columns 5" w:semiHidden="1" w:unhideWhenUsed="1"/>
+    <w:lsdException w:name="Table Grid 1" w:semiHidden="1" w:unhideWhenUsed="1"/>
+    <w:lsdException w:name="Table Grid 2" w:semiHidden="1" w:unhideWhenUsed="1"/>
+    <w:lsdException w:name="Table Grid 3" w:semiHidden="1" w:unhideWhenUsed="1"/>
+    <w:lsdException w:name="Table Grid 4" w:semiHidden="1" w:unhideWhenUsed="1"/>
+    <w:lsdException w:name="Table Grid 5" w:semiHidden="1" w:unhideWhenUsed="1"/>
+    <w:lsdException w:name="Table Grid 6" w:semiHidden="1" w:unhideWhenUsed="1"/>
+    <w:lsdException w:name="Table Grid 7" w:semiHidden="1" w:unhideWhenUsed="1"/>
+    <w:lsdException w:name="Table Grid 8" w:semiHidden="1" w:unhideWhenUsed="1"/>
+    <w:lsdException w:name="Table List 1" w:semiHidden="1" w:unhideWhenUsed="1"/>
+    <w:lsdException w:name="Table List 2" w:semiHidden="1" w:unhideWhenUsed="1"/>
+    <w:lsdException w:name="Table List 3" w:semiHidden="1" w:unhideWhenUsed="1"/>
+    <w:lsdException w:name="Table List 4" w:semiHidden="1" w:unhideWhenUsed="1"/>
+    <w:lsdException w:name="Table List 5" w:semiHidden="1" w:unhideWhenUsed="1"/>
+    <w:lsdException w:name="Table List 6" w:semiHidden="1" w:unhideWhenUsed="1"/>
+    <w:lsdException w:name="Table List 7" w:semiHidden="1" w:unhideWhenUsed="1"/>
+    <w:lsdException w:name="Table List 8" w:semiHidden="1" w:unhideWhenUsed="1"/>
+    <w:lsdException w:name="Table 3D effects 1" w:semiHidden="1" w:unhideWhenUsed="1"/>
+    <w:lsdException w:name="Table 3D effects 2" w:semiHidden="1" w:unhideWhenUsed="1"/>
+    <w:lsdException w:name="Table 3D effects 3" w:semiHidden="1" w:unhideWhenUsed="1"/>
+    <w:lsdException w:name="Table Contemporary" w:semiHidden="1" w:unhideWhenUsed="1"/>
+    <w:lsdException w:name="Table Elegant" w:semiHidden="1" w:unhideWhenUsed="1"/>
+    <w:lsdException w:name="Table Professional" w:semiHidden="1" w:unhideWhenUsed="1"/>
+    <w:lsdException w:name="Table Subtle 1" w:semiHidden="1" w:unhideWhenUsed="1"/>
+    <w:lsdException w:name="Table Subtle 2" w:semiHidden="1" w:unhideWhenUsed="1"/>
+    <w:lsdException w:name="Table Web 1" w:semiHidden="1" w:unhideWhenUsed="1"/>
+    <w:lsdException w:name="Table Web 2" w:semiHidden="1" w:unhideWhenUsed="1"/>
+    <w:lsdException w:name="Table Web 3" w:semiHidden="1" w:unhideWhenUsed="1"/>
+    <w:lsdException w:name="Balloon Text" w:semiHidden="1" w:unhideWhenUsed="1"/>
+    <w:lsdException w:name="Table Grid" w:uiPriority="39"/>
+    <w:lsdException w:name="Table Theme" w:semiHidden="1" w:unhideWhenUsed="1"/>
+    <w:lsdException w:name="Placeholder Text" w:semiHidden="1"/>
+    <w:lsdException w:name="No Spacing" w:uiPriority="1" w:qFormat="1"/>
+    <w:lsdException w:name="Light Shading" w:uiPriority="60"/>
+    <w:lsdException w:name="Light List" w:uiPriority="61"/>
+    <w:lsdException w:name="Light Grid" w:uiPriority="62"/>
+    <w:lsdException w:name="Medium Shading 1" w:uiPriority="63"/>
+    <w:lsdException w:name="Medium Shading 2" w:uiPriority="64"/>
+    <w:lsdException w:name="Medium List 1" w:uiPriority="65"/>
+    <w:lsdException w:name="Medium List 2" w:uiPriority="66"/>
+    <w:lsdException w:name="Medium Grid 1" w:uiPriority="67"/>
+    <w:lsdException w:name="Medium Grid 2" w:uiPriority="68"/>
+    <w:lsdException w:name="Medium Grid 3" w:uiPriority="69"/>
+    <w:lsdException w:name="Dark List" w:uiPriority="70"/>
+    <w:lsdException w:name="Colorful Shading" w:uiPriority="71"/>
+    <w:lsdException w:name="Colorful List" w:uiPriority="72"/>
+    <w:lsdException w:name="Colorful Grid" w:uiPriority="73"/>
+    <w:lsdException w:name="Light Shading Accent 1" w:uiPriority="60"/>
+    <w:lsdException w:name="Light List Accent 1" w:uiPriority="61"/>
+    <w:lsdException w:name="Light Grid Accent 1" w:uiPriority="62"/>
+    <w:lsdException w:name="Medium Shading 1 Accent 1" w:uiPriority="63"/>
+    <w:lsdException w:name="Medium Shading 2 Accent 1" w:uiPriority="64"/>
+    <w:lsdException w:name="Medium List 1 Accent 1" w:uiPriority="65"/>
+    <w:lsdException w:name="Revision" w:semiHidden="1"/>
+    <w:lsdException w:name="List Paragraph" w:uiPriority="34" w:qFormat="1"/>
+    <w:lsdException w:name="Quote" w:uiPriority="29" w:qFormat="1"/>
+    <w:lsdException w:name="Intense Quote" w:uiPriority="30" w:qFormat="1"/>
+    <w:lsdException w:name="Medium List 2 Accent 1" w:uiPriority="66"/>
+    <w:lsdException w:name="Medium Grid 1 Accent 1" w:uiPriority="67"/>
+    <w:lsdException w:name="Medium Grid 2 Accent 1" w:uiPriority="68"/>
+    <w:lsdException w:name="Medium Grid 3 Accent 1" w:uiPriority="69"/>
+    <w:lsdException w:name="Dark List Accent 1" w:uiPriority="70"/>
+    <w:lsdException w:name="Colorful Shading Accent 1" w:uiPriority="71"/>
+    <w:lsdException w:name="Colorful List Accent 1" w:uiPriority="72"/>
+    <w:lsdException w:name="Colorful Grid Accent 1" w:uiPriority="73"/>
+    <w:lsdException w:name="Light Shading Accent 2" w:uiPriority="60"/>
+    <w:lsdException w:name="Light List Accent 2" w:uiPriority="61"/>
+    <w:lsdException w:name="Light Grid Accent 2" w:uiPriority="62"/>
+    <w:lsdException w:name="Medium Shading 1 Accent 2" w:uiPriority="63"/>
+    <w:lsdException w:name="Medium Shading 2 Accent 2" w:uiPriority="64"/>
+    <w:lsdException w:name="Medium List 1 Accent 2" w:uiPriority="65"/>
+    <w:lsdException w:name="Medium List 2 Accent 2" w:uiPriority="66"/>
+    <w:lsdException w:name="Medium Grid 1 Accent 2" w:uiPriority="67"/>
+    <w:lsdException w:name="Medium Grid 2 Accent 2" w:uiPriority="68"/>
+    <w:lsdException w:name="Medium Grid 3 Accent 2" w:uiPriority="69"/>
+    <w:lsdException w:name="Dark List Accent 2" w:uiPriority="70"/>
+    <w:lsdException w:name="Colorful Shading Accent 2" w:uiPriority="71"/>
+    <w:lsdException w:name="Colorful List Accent 2" w:uiPriority="72"/>
+    <w:lsdException w:name="Colorful Grid Accent 2" w:uiPriority="73"/>
+    <w:lsdException w:name="Light Shading Accent 3" w:uiPriority="60"/>
+    <w:lsdException w:name="Light List Accent 3" w:uiPriority="61"/>
+    <w:lsdException w:name="Light Grid Accent 3" w:uiPriority="62"/>
+    <w:lsdException w:name="Medium Shading 1 Accent 3" w:uiPriority="63"/>
+    <w:lsdException w:name="Medium Shading 2 Accent 3" w:uiPriority="64"/>
+    <w:lsdException w:name="Medium List 1 Accent 3" w:uiPriority="65"/>
+    <w:lsdException w:name="Medium List 2 Accent 3" w:uiPriority="66"/>
+    <w:lsdException w:name="Medium Grid 1 Accent 3" w:uiPriority="67"/>
+    <w:lsdException w:name="Medium Grid 2 Accent 3" w:uiPriority="68"/>
+    <w:lsdException w:name="Medium Grid 3 Accent 3" w:uiPriority="69"/>
+    <w:lsdException w:name="Dark List Accent 3" w:uiPriority="70"/>
+    <w:lsdException w:name="Colorful Shading Accent 3" w:uiPriority="71"/>
+    <w:lsdException w:name="Colorful List Accent 3" w:uiPriority="72"/>
+    <w:lsdException w:name="Colorful Grid Accent 3" w:uiPriority="73"/>
+    <w:lsdException w:name="Light Shading Accent 4" w:uiPriority="60"/>
+    <w:lsdException w:name="Light List Accent 4" w:uiPriority="61"/>
+    <w:lsdException w:name="Light Grid Accent 4" w:uiPriority="62"/>
+    <w:lsdException w:name="Medium Shading 1 Accent 4" w:uiPriority="63"/>
+    <w:lsdException w:name="Medium Shading 2 Accent 4" w:uiPriority="64"/>
+    <w:lsdException w:name="Medium List 1 Accent 4" w:uiPriority="65"/>
+    <w:lsdException w:name="Medium List 2 Accent 4" w:uiPriority="66"/>
+    <w:lsdException w:name="Medium Grid 1 Accent 4" w:uiPriority="67"/>
+    <w:lsdException w:name="Medium Grid 2 Accent 4" w:uiPriority="68"/>
+    <w:lsdException w:name="Medium Grid 3 Accent 4" w:uiPriority="69"/>
+    <w:lsdException w:name="Dark List Accent 4" w:uiPriority="70"/>
+    <w:lsdException w:name="Colorful Shading Accent 4" w:uiPriority="71"/>
+    <w:lsdException w:name="Colorful List Accent 4" w:uiPriority="72"/>
+    <w:lsdException w:name="Colorful Grid Accent 4" w:uiPriority="73"/>
+    <w:lsdException w:name="Light Shading Accent 5" w:uiPriority="60"/>
+    <w:lsdException w:name="Light List Accent 5" w:uiPriority="61"/>
+    <w:lsdException w:name="Light Grid Accent 5" w:uiPriority="62"/>
+    <w:lsdException w:name="Medium Shading 1 Accent 5" w:uiPriority="63"/>
+    <w:lsdException w:name="Medium Shading 2 Accent 5" w:uiPriority="64"/>
+    <w:lsdException w:name="Medium List 1 Accent 5" w:uiPriority="65"/>
+    <w:lsdException w:name="Medium List 2 Accent 5" w:uiPriority="66"/>
+    <w:lsdException w:name="Medium Grid 1 Accent 5" w:uiPriority="67"/>
+    <w:lsdException w:name="Medium Grid 2 Accent 5" w:uiPriority="68"/>
+    <w:lsdException w:name="Medium Grid 3 Accent 5" w:uiPriority="69"/>
+    <w:lsdException w:name="Dark List Accent 5" w:uiPriority="70"/>
+    <w:lsdException w:name="Colorful Shading Accent 5" w:uiPriority="71"/>
+    <w:lsdException w:name="Colorful List Accent 5" w:uiPriority="72"/>
+    <w:lsdException w:name="Colorful Grid Accent 5" w:uiPriority="73"/>
+    <w:lsdException w:name="Light Shading Accent 6" w:uiPriority="60"/>
+    <w:lsdException w:name="Light List Accent 6" w:uiPriority="61"/>
+    <w:lsdException w:name="Light Grid Accent 6" w:uiPriority="62"/>
+    <w:lsdException w:name="Medium Shading 1 Accent 6" w:uiPriority="63"/>
+    <w:lsdException w:name="Medium Shading 2 Accent 6" w:uiPriority="64"/>
+    <w:lsdException w:name="Medium List 1 Accent 6" w:uiPriority="65"/>
+    <w:lsdException w:name="Medium List 2 Accent 6" w:uiPriority="66"/>
+    <w:lsdException w:name="Medium Grid 1 Accent 6" w:uiPriority="67"/>
+    <w:lsdException w:name="Medium Grid 2 Accent 6" w:uiPriority="68"/>
+    <w:lsdException w:name="Medium Grid 3 Accent 6" w:uiPriority="69"/>
+    <w:lsdException w:name="Dark List Accent 6" w:uiPriority="70"/>
+    <w:lsdException w:name="Colorful Shading Accent 6" w:uiPriority="71"/>
+    <w:lsdException w:name="Colorful List Accent 6" w:uiPriority="72"/>
+    <w:lsdException w:name="Colorful Grid Accent 6" w:uiPriority="73"/>
+    <w:lsdException w:name="Subtle Emphasis" w:uiPriority="19" w:qFormat="1"/>
+    <w:lsdException w:name="Intense Emphasis" w:uiPriority="21" w:qFormat="1"/>
+    <w:lsdException w:name="Subtle Reference" w:uiPriority="31" w:qFormat="1"/>
+    <w:lsdException w:name="Intense Reference" w:uiPriority="32" w:qFormat="1"/>
+    <w:lsdException w:name="Book Title" w:uiPriority="33" w:qFormat="1"/>
+    <w:lsdException w:name="Bibliography" w:semiHidden="1" w:uiPriority="37" w:unhideWhenUsed="1"/>
+    <w:lsdException w:name="TOC Heading" w:semiHidden="1" w:uiPriority="39" w:unhideWhenUsed="1" w:qFormat="1"/>
+    <w:lsdException w:name="Plain Table 1" w:uiPriority="41"/>
+    <w:lsdException w:name="Plain Table 2" w:uiPriority="42"/>
+    <w:lsdException w:name="Plain Table 3" w:uiPriority="43"/>
+    <w:lsdException w:name="Plain Table 4" w:uiPriority="44"/>
+    <w:lsdException w:name="Plain Table 5" w:uiPriority="45"/>
+    <w:lsdException w:name="Grid Table Light" w:uiPriority="40"/>
+    <w:lsdException w:name="Grid Table 1 Light" w:uiPriority="46"/>
+    <w:lsdException w:name="Grid Table 2" w:uiPriority="47"/>
+    <w:lsdException w:name="Grid Table 3" w:uiPriority="48"/>
+    <w:lsdException w:name="Grid Table 4" w:uiPriority="49"/>
+    <w:lsdException w:name="Grid Table 5 Dark" w:uiPriority="50"/>
+    <w:lsdException w:name="Grid Table 6 Colorful" w:uiPriority="51"/>
+    <w:lsdException w:name="Grid Table 7 Colorful" w:uiPriority="52"/>
+    <w:lsdException w:name="Grid Table 1 Light Accent 1" w:uiPriority="46"/>
+    <w:lsdException w:name="Grid Table 2 Accent 1" w:uiPriority="47"/>
+    <w:lsdException w:name="Grid Table 3 Accent 1" w:uiPriority="48"/>
+    <w:lsdException w:name="Grid Table 4 Accent 1" w:uiPriority="49"/>
+    <w:lsdException w:name="Grid Table 5 Dark Accent 1" w:uiPriority="50"/>
+    <w:lsdException w:name="Grid Table 6 Colorful Accent 1" w:uiPriority="51"/>
+    <w:lsdException w:name="Grid Table 7 Colorful Accent 1" w:uiPriority="52"/>
+    <w:lsdException w:name="Grid Table 1 Light Accent 2" w:uiPriority="46"/>
+    <w:lsdException w:name="Grid Table 2 Accent 2" w:uiPriority="47"/>
+    <w:lsdException w:name="Grid Table 3 Accent 2" w:uiPriority="48"/>
+    <w:lsdException w:name="Grid Table 4 Accent 2" w:uiPriority="49"/>
+    <w:lsdException w:name="Grid Table 5 Dark Accent 2" w:uiPriority="50"/>
+    <w:lsdException w:name="Grid Table 6 Colorful Accent 2" w:uiPriority="51"/>
+    <w:lsdException w:name="Grid Table 7 Colorful Accent 2" w:uiPriority="52"/>
+    <w:lsdException w:name="Grid Table 1 Light Accent 3" w:uiPriority="46"/>
+    <w:lsdException w:name="Grid Table 2 Accent 3" w:uiPriority="47"/>
+    <w:lsdException w:name="Grid Table 3 Accent 3" w:uiPriority="48"/>
+    <w:lsdException w:name="Grid Table 4 Accent 3" w:uiPriority="49"/>
+    <w:lsdException w:name="Grid Table 5 Dark Accent 3" w:uiPriority="50"/>
+    <w:lsdException w:name="Grid Table 6 Colorful Accent 3" w:uiPriority="51"/>
+    <w:lsdException w:name="Grid Table 7 Colorful Accent 3" w:uiPriority="52"/>
+    <w:lsdException w:name="Grid Table 1 Light Accent 4" w:uiPriority="46"/>
+    <w:lsdException w:name="Grid Table 2 Accent 4" w:uiPriority="47"/>
+    <w:lsdException w:name="Grid Table 3 Accent 4" w:uiPriority="48"/>
+    <w:lsdException w:name="Grid Table 4 Accent 4" w:uiPriority="49"/>
+    <w:lsdException w:name="Grid Table 5 Dark Accent 4" w:uiPriority="50"/>
+    <w:lsdException w:name="Grid Table 6 Colorful Accent 4" w:uiPriority="51"/>
+    <w:lsdException w:name="Grid Table 7 Colorful Accent 4" w:uiPriority="52"/>
+    <w:lsdException w:name="Grid Table 1 Light Accent 5" w:uiPriority="46"/>
+    <w:lsdException w:name="Grid Table 2 Accent 5" w:uiPriority="47"/>
+    <w:lsdException w:name="Grid Table 3 Accent 5" w:uiPriority="48"/>
+    <w:lsdException w:name="Grid Table 4 Accent 5" w:uiPriority="49"/>
+    <w:lsdException w:name="Grid Table 5 Dark Accent 5" w:uiPriority="50"/>
+    <w:lsdException w:name="Grid Table 6 Colorful Accent 5" w:uiPriority="51"/>
+    <w:lsdException w:name="Grid Table 7 Colorful Accent 5" w:uiPriority="52"/>
+    <w:lsdException w:name="Grid Table 1 Light Accent 6" w:uiPriority="46"/>
+    <w:lsdException w:name="Grid Table 2 Accent 6" w:uiPriority="47"/>
+    <w:lsdException w:name="Grid Table 3 Accent 6" w:uiPriority="48"/>
+    <w:lsdException w:name="Grid Table 4 Accent 6" w:uiPriority="49"/>
+    <w:lsdException w:name="Grid Table 5 Dark Accent 6" w:uiPriority="50"/>
+    <w:lsdException w:name="Grid Table 6 Colorful Accent 6" w:uiPriority="51"/>
+    <w:lsdException w:name="Grid Table 7 Colorful Accent 6" w:uiPriority="52"/>
+    <w:lsdException w:name="List Table 1 Light" w:uiPriority="46"/>
+    <w:lsdException w:name="List Table 2" w:uiPriority="47"/>
+    <w:lsdException w:name="List Table 3" w:uiPriority="48"/>
+    <w:lsdException w:name="List Table 4" w:uiPriority="49"/>
+    <w:lsdException w:name="List Table 5 Dark" w:uiPriority="50"/>
+    <w:lsdException w:name="List Table 6 Colorful" w:uiPriority="51"/>
+    <w:lsdException w:name="List Table 7 Colorful" w:uiPriority="52"/>
+    <w:lsdException w:name="List Table 1 Light Accent 1" w:uiPriority="46"/>
+    <w:lsdException w:name="List Table 2 Accent 1" w:uiPriority="47"/>
+    <w:lsdException w:name="List Table 3 Accent 1" w:uiPriority="48"/>
+    <w:lsdException w:name="List Table 4 Accent 1" w:uiPriority="49"/>
+    <w:lsdException w:name="List Table 5 Dark Accent 1" w:uiPriority="50"/>
+    <w:lsdException w:name="List Table 6 Colorful Accent 1" w:uiPriority="51"/>
+    <w:lsdException w:name="List Table 7 Colorful Accent 1" w:uiPriority="52"/>
+    <w:lsdException w:name="List Table 1 Light Accent 2" w:uiPriority="46"/>
+    <w:lsdException w:name="List Table 2 Accent 2" w:uiPriority="47"/>
+    <w:lsdException w:name="List Table 3 Accent 2" w:uiPriority="48"/>
+    <w:lsdException w:name="List Table 4 Accent 2" w:uiPriority="49"/>
+    <w:lsdException w:name="List Table 5 Dark Accent 2" w:uiPriority="50"/>
+    <w:lsdException w:name="List Table 6 Colorful Accent 2" w:uiPriority="51"/>
+    <w:lsdException w:name="List Table 7 Colorful Accent 2" w:uiPriority="52"/>
+    <w:lsdException w:name="List Table 1 Light Accent 3" w:uiPriority="46"/>
+    <w:lsdException w:name="List Table 2 Accent 3" w:uiPriority="47"/>
+    <w:lsdException w:name="List Table 3 Accent 3" w:uiPriority="48"/>
+    <w:lsdException w:name="List Table 4 Accent 3" w:uiPriority="49"/>
+    <w:lsdException w:name="List Table 5 Dark Accent 3" w:uiPriority="50"/>
+    <w:lsdException w:name="List Table 6 Colorful Accent 3" w:uiPriority="51"/>
+    <w:lsdException w:name="List Table 7 Colorful Accent 3" w:uiPriority="52"/>
+    <w:lsdException w:name="List Table 1 Light Accent 4" w:uiPriority="46"/>
+    <w:lsdException w:name="List Table 2 Accent 4" w:uiPriority="47"/>
+    <w:lsdException w:name="List Table 3 Accent 4" w:uiPriority="48"/>
+    <w:lsdException w:name="List Table 4 Accent 4" w:uiPriority="49"/>
+    <w:lsdException w:name="List Table 5 Dark Accent 4" w:uiPriority="50"/>
+    <w:lsdException w:name="List Table 6 Colorful Accent 4" w:uiPriority="51"/>
+    <w:lsdException w:name="List Table 7 Colorful Accent 4" w:uiPriority="52"/>
+    <w:lsdException w:name="List Table 1 Light Accent 5" w:uiPriority="46"/>
+    <w:lsdException w:name="List Table 2 Accent 5" w:uiPriority="47"/>
+    <w:lsdException w:name="List Table 3 Accent 5" w:uiPriority="48"/>
+    <w:lsdException w:name="List Table 4 Accent 5" w:uiPriority="49"/>
+    <w:lsdException w:name="List Table 5 Dark Accent 5" w:uiPriority="50"/>
+    <w:lsdException w:name="List Table 6 Colorful Accent 5" w:uiPriority="51"/>
+    <w:lsdException w:name="List Table 7 Colorful Accent 5" w:uiPriority="52"/>
+    <w:lsdException w:name="List Table 1 Light Accent 6" w:uiPriority="46"/>
+    <w:lsdException w:name="List Table 2 Accent 6" w:uiPriority="47"/>
+    <w:lsdException w:name="List Table 3 Accent 6" w:uiPriority="48"/>
+    <w:lsdException w:name="List Table 4 Accent 6" w:uiPriority="49"/>
+    <w:lsdException w:name="List Table 5 Dark Accent 6" w:uiPriority="50"/>
+    <w:lsdException w:name="List Table 6 Colorful Accent 6" w:uiPriority="51"/>
+    <w:lsdException w:name="List Table 7 Colorful Accent 6" w:uiPriority="52"/>
+    <w:lsdException w:name="Mention" w:semiHidden="1" w:unhideWhenUsed="1"/>
+    <w:lsdException w:name="Smart Hyperlink" w:semiHidden="1" w:unhideWhenUsed="1"/>
+    <w:lsdException w:name="Hashtag" w:semiHidden="1" w:unhideWhenUsed="1"/>
+    <w:lsdException w:name="Unresolved Mention" w:semiHidden="1" w:unhideWhenUsed="1"/>
+    <w:lsdException w:name="Smart Link" w:semiHidden="1" w:unhideWhenUsed="1"/>
+  </w:latentStyles>
+  <w:style w:type="paragraph" w:default="1" w:styleId="Normal">
+    <w:name w:val="Normal"/>
+    <w:qFormat/>
+  </w:style>
+  <w:style w:type="character" w:default="1" w:styleId="DefaultParagraphFont">
+    <w:name w:val="Default Paragraph Font"/>
+    <w:uiPriority w:val="1"/>
+    <w:semiHidden/>
+    <w:unhideWhenUsed/>
+  </w:style>
+  <w:style w:type="table" w:default="1" w:styleId="TableNormal">
+    <w:name w:val="Normal Table"/>
+    <w:uiPriority w:val="99"/>
+    <w:semiHidden/>
+    <w:unhideWhenUsed/>
+    <w:tblPr>
+      <w:tblInd w:w="0" w:type="dxa"/>
+      <w:tblCellMar>
+        <w:top w:w="0" w:type="dxa"/>
+        <w:left w:w="108" w:type="dxa"/>
+        <w:bottom w:w="0" w:type="dxa"/>
+        <w:right w:w="108" w:type="dxa"/>
+      </w:tblCellMar>
+    </w:tblPr>
+  </w:style>
+  <w:style w:type="numbering" w:default="1" w:styleId="NoList">
+    <w:name w:val="No List"/>
+    <w:uiPriority w:val="99"/>
+    <w:semiHidden/>
+    <w:unhideWhenUsed/>
+  </w:style>
+  <w:style w:type="character" w:styleId="PlaceholderText">
+    <w:name w:val="Placeholder Text"/>
     <w:basedOn w:val="DefaultParagraphFont"/>
-    <w:link w:val="Title"/>
-    <w:uiPriority w:val="10"/>
+    <w:uiPriority w:val="99"/>
     <w:semiHidden/>
-    <w:rsid w:val="009E1F75"/>
-    <w:rPr>
-      <w:rFonts w:asciiTheme="majorHAnsi" w:eastAsiaTheme="majorEastAsia" w:hAnsiTheme="majorHAnsi" w:cstheme="majorBidi"/>
-      <w:spacing w:val="-10"/>
-      <w:kern w:val="28"/>
-      <w:sz w:val="56"/>
-      <w:szCs w:val="56"/>
-    </w:rPr>
+    <w:rPr>
+      <w:color w:val="808080"/>
+    </w:rPr>
+  </w:style>
+  <w:style w:type="paragraph" w:customStyle="1" w:styleId="7D12028B95D1447F9D38610B8038AAD5">
+    <w:name w:val="7D12028B95D1447F9D38610B8038AAD5"/>
   </w:style>
 </w:styles>
+</file>
+
+<file path=word/glossary/webSettings.xml><?xml version="1.0" encoding="utf-8"?>
+<w:webSettings xmlns:mc="http://schemas.openxmlformats.org/markup-compatibility/2006" xmlns:r="http://schemas.openxmlformats.org/officeDocument/2006/relationships" xmlns:w="http://schemas.openxmlformats.org/wordprocessingml/2006/main" xmlns:w14="http://schemas.microsoft.com/office/word/2010/wordml" xmlns:w15="http://schemas.microsoft.com/office/word/2012/wordml" xmlns:w16cex="http://schemas.microsoft.com/office/word/2018/wordml/cex" xmlns:w16cid="http://schemas.microsoft.com/office/word/2016/wordml/cid" xmlns:w16="http://schemas.microsoft.com/office/word/2018/wordml" xmlns:w16du="http://schemas.microsoft.com/office/word/2023/wordml/word16du" xmlns:w16sdtdh="http://schemas.microsoft.com/office/word/2020/wordml/sdtdatahash" xmlns:w16se="http://schemas.microsoft.com/office/word/2015/wordml/symex" mc:Ignorable="w14 w15 w16se w16cid w16 w16cex w16sdtdh w16du">
+  <w:optimizeForBrowser/>
+  <w:allowPNG/>
+</w:webSettings>
 </file>
 
 <file path=word/theme/theme1.xml><?xml version="1.0" encoding="utf-8"?>
@@ -5994,6 +6693,27 @@
 </file>
 
 <file path=customXml/item1.xml><?xml version="1.0" encoding="utf-8"?>
+<p:properties xmlns:p="http://schemas.microsoft.com/office/2006/metadata/properties" xmlns:xsi="http://www.w3.org/2001/XMLSchema-instance" xmlns:pc="http://schemas.microsoft.com/office/infopath/2007/PartnerControls">
+  <documentManagement>
+    <CodeofPracticeArea xmlns="46765bbe-c8f8-420d-9195-86969fce2ee8" xsi:nil="true"/>
+  </documentManagement>
+</p:properties>
+</file>
+
+<file path=customXml/item2.xml><?xml version="1.0" encoding="utf-8"?>
+<?mso-contentType ?>
+<FormTemplates xmlns="http://schemas.microsoft.com/sharepoint/v3/contenttype/forms">
+  <Display>DocumentLibraryForm</Display>
+  <Edit>DocumentLibraryForm</Edit>
+  <New>DocumentLibraryForm</New>
+</FormTemplates>
+</file>
+
+<file path=customXml/item3.xml><?xml version="1.0" encoding="utf-8"?>
+<b:Sources xmlns:b="http://schemas.openxmlformats.org/officeDocument/2006/bibliography" xmlns="http://schemas.openxmlformats.org/officeDocument/2006/bibliography" SelectedStyle="\APASixthEditionOfficeOnline.xsl" StyleName="APA" Version="6"/>
+</file>
+
+<file path=customXml/item4.xml><?xml version="1.0" encoding="utf-8"?>
 <ct:contentTypeSchema xmlns:ct="http://schemas.microsoft.com/office/2006/metadata/contentType" xmlns:ma="http://schemas.microsoft.com/office/2006/metadata/properties/metaAttributes" ct:_="" ma:_="" ma:contentTypeName="Document" ma:contentTypeID="0x0101006FEA4C53B746E94690A2D2779EA3A212" ma:contentTypeVersion="6" ma:contentTypeDescription="Create a new document." ma:contentTypeScope="" ma:versionID="00d3e3f3bc328837a20c2e22e19c095f">
   <xsd:schema xmlns:xsd="http://www.w3.org/2001/XMLSchema" xmlns:xs="http://www.w3.org/2001/XMLSchema" xmlns:p="http://schemas.microsoft.com/office/2006/metadata/properties" xmlns:ns2="46765bbe-c8f8-420d-9195-86969fce2ee8" xmlns:ns3="d7603273-e2cd-41f3-b8bd-db88c5b2d89a" targetNamespace="http://schemas.microsoft.com/office/2006/metadata/properties" ma:root="true" ma:fieldsID="def79d6b71b14cb5563aeb901c332009" ns2:_="" ns3:_="">
     <xsd:import namespace="46765bbe-c8f8-420d-9195-86969fce2ee8"/>
@@ -6172,28 +6892,33 @@
 </ct:contentTypeSchema>
 </file>
 
-<file path=customXml/item2.xml><?xml version="1.0" encoding="utf-8"?>
-<p:properties xmlns:p="http://schemas.microsoft.com/office/2006/metadata/properties" xmlns:xsi="http://www.w3.org/2001/XMLSchema-instance" xmlns:pc="http://schemas.microsoft.com/office/infopath/2007/PartnerControls">
-  <documentManagement>
-    <CodeofPracticeArea xmlns="46765bbe-c8f8-420d-9195-86969fce2ee8" xsi:nil="true"/>
-  </documentManagement>
-</p:properties>
+<file path=customXml/itemProps1.xml><?xml version="1.0" encoding="utf-8"?>
+<ds:datastoreItem xmlns:ds="http://schemas.openxmlformats.org/officeDocument/2006/customXml" ds:itemID="{6BA2688C-114F-4086-A3A1-6C7FB0D8A225}">
+  <ds:schemaRefs>
+    <ds:schemaRef ds:uri="http://schemas.microsoft.com/office/2006/metadata/properties"/>
+    <ds:schemaRef ds:uri="http://schemas.microsoft.com/office/infopath/2007/PartnerControls"/>
+    <ds:schemaRef ds:uri="46765bbe-c8f8-420d-9195-86969fce2ee8"/>
+  </ds:schemaRefs>
+</ds:datastoreItem>
 </file>
 
-<file path=customXml/item3.xml><?xml version="1.0" encoding="utf-8"?>
-<?mso-contentType ?>
-<FormTemplates xmlns="http://schemas.microsoft.com/sharepoint/v3/contenttype/forms">
-  <Display>DocumentLibraryForm</Display>
-  <Edit>DocumentLibraryForm</Edit>
-  <New>DocumentLibraryForm</New>
-</FormTemplates>
+<file path=customXml/itemProps2.xml><?xml version="1.0" encoding="utf-8"?>
+<ds:datastoreItem xmlns:ds="http://schemas.openxmlformats.org/officeDocument/2006/customXml" ds:itemID="{909CB5D3-5BFD-4BBC-9F32-751451F9C34C}">
+  <ds:schemaRefs>
+    <ds:schemaRef ds:uri="http://schemas.microsoft.com/sharepoint/v3/contenttype/forms"/>
+  </ds:schemaRefs>
+</ds:datastoreItem>
 </file>
 
-<file path=customXml/item4.xml><?xml version="1.0" encoding="utf-8"?>
-<b:Sources xmlns:b="http://schemas.openxmlformats.org/officeDocument/2006/bibliography" xmlns="http://schemas.openxmlformats.org/officeDocument/2006/bibliography" SelectedStyle="\APASixthEditionOfficeOnline.xsl" StyleName="APA" Version="6"/>
+<file path=customXml/itemProps3.xml><?xml version="1.0" encoding="utf-8"?>
+<ds:datastoreItem xmlns:ds="http://schemas.openxmlformats.org/officeDocument/2006/customXml" ds:itemID="{3849E116-B3D2-4241-A515-0A0CC5376A28}">
+  <ds:schemaRefs>
+    <ds:schemaRef ds:uri="http://schemas.openxmlformats.org/officeDocument/2006/bibliography"/>
+  </ds:schemaRefs>
+</ds:datastoreItem>
 </file>
 
-<file path=customXml/itemProps1.xml><?xml version="1.0" encoding="utf-8"?>
+<file path=customXml/itemProps4.xml><?xml version="1.0" encoding="utf-8"?>
 <ds:datastoreItem xmlns:ds="http://schemas.openxmlformats.org/officeDocument/2006/customXml" ds:itemID="{C9018D3F-3AB1-4109-AD02-97DDD4B27488}">
   <ds:schemaRefs>
     <ds:schemaRef ds:uri="http://schemas.microsoft.com/office/2006/metadata/contentType"/>
@@ -6210,30 +6935,4 @@
     <ds:schemaRef ds:uri="http://schemas.microsoft.com/internal/obd"/>
   </ds:schemaRefs>
 </ds:datastoreItem>
-</file>
-
-<file path=customXml/itemProps2.xml><?xml version="1.0" encoding="utf-8"?>
-<ds:datastoreItem xmlns:ds="http://schemas.openxmlformats.org/officeDocument/2006/customXml" ds:itemID="{6BA2688C-114F-4086-A3A1-6C7FB0D8A225}">
-  <ds:schemaRefs>
-    <ds:schemaRef ds:uri="http://schemas.microsoft.com/office/2006/metadata/properties"/>
-    <ds:schemaRef ds:uri="http://schemas.microsoft.com/office/infopath/2007/PartnerControls"/>
-    <ds:schemaRef ds:uri="46765bbe-c8f8-420d-9195-86969fce2ee8"/>
-  </ds:schemaRefs>
-</ds:datastoreItem>
-</file>
-
-<file path=customXml/itemProps3.xml><?xml version="1.0" encoding="utf-8"?>
-<ds:datastoreItem xmlns:ds="http://schemas.openxmlformats.org/officeDocument/2006/customXml" ds:itemID="{909CB5D3-5BFD-4BBC-9F32-751451F9C34C}">
-  <ds:schemaRefs>
-    <ds:schemaRef ds:uri="http://schemas.microsoft.com/sharepoint/v3/contenttype/forms"/>
-  </ds:schemaRefs>
-</ds:datastoreItem>
-</file>
-
-<file path=customXml/itemProps4.xml><?xml version="1.0" encoding="utf-8"?>
-<ds:datastoreItem xmlns:ds="http://schemas.openxmlformats.org/officeDocument/2006/customXml" ds:itemID="{3849E116-B3D2-4241-A515-0A0CC5376A28}">
-  <ds:schemaRefs>
-    <ds:schemaRef ds:uri="http://schemas.openxmlformats.org/officeDocument/2006/bibliography"/>
-  </ds:schemaRefs>
-</ds:datastoreItem>
 </file>
</xml_diff>